<commit_message>
Prepare Paper 1 public release
</commit_message>
<xml_diff>
--- a/docs/paper/submission/measurement_validation_submission.docx
+++ b/docs/paper/submission/measurement_validation_submission.docx
@@ -59,7 +59,7 @@
         <w:t xml:space="preserve">r=0.940</w:t>
       </w:r>
       <w:r>
-        <w:t xml:space="preserve">). Mechanistic manipulations then separated their computational substrates: workspace mechanisms supported boundary and identity-temporal measures, action-outcome loops supported agency and action ownership, and meta-monitoring supported distributed body-schema measures. Subsequent Transformer diagnostics showed that action-loop effects generalize to an attention-based substrate, while boundary-self validation remains measurement-limited. These results support a validation-first approach: theoretically motivated proxies can misidentify constructs, but diagnostic failures can be used to refine the construct space before making mechanistic claims.</w:t>
+        <w:t xml:space="preserve">). Mechanistic manipulations then separated their computational substrates: workspace mechanisms supported boundary and identity-temporal measures, action-outcome loops supported agency and action ownership, and meta-monitoring supported distributed body-schema measures. A subsequent minimal attention-based diagnostic showed that action-loop effects generalize to an attention-based substrate, while boundary-self validation remains measurement-limited. All architectures studied here are small custom simulations used as controlled measurement testbeds, not production-scale language models. The pattern argues that proxy validation should precede mechanistic interpretation, and that diagnostic failures of theoretically motivated proxies can themselves refine the construct set.</w:t>
       </w:r>
     </w:p>
     <w:bookmarkEnd w:id="9"/>
@@ -93,7 +93,7 @@
         <w:pStyle w:val="BodyText"/>
       </w:pPr>
       <w:r>
-        <w:t xml:space="preserve">We studied this problem in three primary research contexts: a thalamus-inspired architecture with reticular gating and a limited workspace, a distributed multi-agent architecture with local agents and a meta-monitor, and an artificial-life quality-diversity archive used as open-ended search context. A subsequent Transformer-inspired follow-up tested whether the main mechanism pattern survived in an attention-based substrate. Early experiments suggested self-agency dissociations, but measurement validation revealed that some proxies were mislabeled. We therefore shifted from mechanism interpretation to measurement validation.</w:t>
+        <w:t xml:space="preserve">We studied this problem in three primary research contexts: a thalamus-inspired architecture with reticular gating and a limited workspace, a distributed multi-agent architecture with local agents and a meta-monitor, and an artificial-life quality-diversity archive used as open-ended search context. A subsequent minimal attention-based follow-up tested whether the main mechanism pattern survived in a Transformer-style substrate. These systems are deliberately small custom simulations, not production-scale neural networks or large language models. Early experiments suggested self-agency dissociations, but measurement validation revealed that some proxies were mislabeled. We therefore shifted from mechanism interpretation to measurement validation.</w:t>
       </w:r>
     </w:p>
     <w:p>
@@ -109,7 +109,7 @@
         <w:pStyle w:val="BodyText"/>
       </w:pPr>
       <w:r>
-        <w:t xml:space="preserve">The paper makes three contributions. First, it shows that a theoretically motivated proxy can fail in a structured way: the original agency proxy was strongly anti-correlated with independent tests because it measured gating rather than action-outcome control. Second, it uses this failure to refine the construct set, separating action agency, boundary self, identity-temporal self, action ownership, and distributed body-schema self. Third, it links these validated operational constructs to separable computational substrates–workspace, action-outcome loops, and meta-monitoring–while using subsequent Transformer diagnostics to show that mechanism generalization and construct validation can diverge.</w:t>
+        <w:t xml:space="preserve">The paper makes three contributions. First, it shows that a theoretically motivated proxy can fail in a structured way: the original agency proxy was strongly anti-correlated with independent tests because it measured gating rather than action-outcome control. Second, it uses this failure to refine the construct set, separating action agency, boundary self, identity-temporal self, action ownership, and distributed body-schema self. Third, it links these validated constructs to separable computational substrates–workspace, action-outcome loops, and meta-monitoring–while using subsequent attention-based diagnostics to show that mechanism generalization and construct validation can diverge.</w:t>
       </w:r>
     </w:p>
     <w:bookmarkStart w:id="10" w:name="related-work-and-measurement-framing"/>
@@ -151,6 +151,14 @@
       </w:pPr>
       <w:r>
         <w:t xml:space="preserve">The measurement strategy comes from construct-validity research. Psychological measurement has long distinguished theoretical constructs from their indicators, and has emphasized convergent and discriminant validation across methods (Cronbach and Meehl, 1955; Campbell and Fiske, 1959; Borsboom et al., 2004). Artificial consciousness research often uses operational proxies, but proxy validity is rarely cross-validated against independent behavioral probes (Gamez, 2008; Reggia, 2013; Haladjian and Montemayor, 2016). This paper treats artificial architectures as measurement testbeds: if a proxy fails, the failure is informative because mechanisms can be cleanly separated and retested.</w:t>
+      </w:r>
+    </w:p>
+    <w:p>
+      <w:pPr>
+        <w:pStyle w:val="BodyText"/>
+      </w:pPr>
+      <w:r>
+        <w:t xml:space="preserve">Recent AI-consciousness discussions make this measurement problem more urgent. Indicator-based assessments of AI consciousness emphasize that current systems should be evaluated against theory-derived properties rather than surface impressions alone (Butlin et al., 2023; Chalmers, 2023). Related work on AI welfare stresses uncertainty about consciousness and robust agency while warning against overconfident attribution (Long et al., 2024), and analyses of language-model consciousness highlight the risk of anthropomorphic interpretation in Transformer-based systems (Shardlow and Przybyla, 2024). Integrated Information Theory 4.0 offers a different formal route through intrinsic causal structure (Albantakis et al., 2023), which we do not attempt to compute here. The interpretability literature makes a parallel methodological point: technical labels can hide multiple concepts unless the target construct is made explicit (Lipton, 2018).</w:t>
       </w:r>
     </w:p>
     <w:bookmarkEnd w:id="10"/>
@@ -315,13 +323,13 @@
       </w:r>
     </w:p>
     <w:bookmarkEnd w:id="14"/>
-    <w:bookmarkStart w:id="15" w:name="transformer-inspired-follow-up"/>
+    <w:bookmarkStart w:id="15" w:name="minimal-attention-based-follow-up"/>
     <w:p>
       <w:pPr>
         <w:pStyle w:val="Heading3"/>
       </w:pPr>
       <w:r>
-        <w:t xml:space="preserve">Transformer-Inspired Follow-Up</w:t>
+        <w:t xml:space="preserve">Minimal Attention-Based Follow-Up</w:t>
       </w:r>
     </w:p>
     <w:p>
@@ -329,15 +337,15 @@
         <w:pStyle w:val="FirstParagraph"/>
       </w:pPr>
       <w:r>
-        <w:t xml:space="preserve">A subsequent Transformer-inspired system was used for cross-architecture diagnosis. It contains a small attention block over synthetic tokens, optional workspace-like memory, and optional action-outcome loops. The purpose was not to model production language models or subjective report, but to test whether the same operational manipulations behave similarly in an attention-based substrate.</w:t>
-      </w:r>
-    </w:p>
-    <w:p>
-      <w:pPr>
-        <w:pStyle w:val="BodyText"/>
-      </w:pPr>
-      <w:r>
-        <w:t xml:space="preserve">The Transformer follow-up crossed workspace availability with action-loop availability using the same notation as the thalamus factorial design:</w:t>
+        <w:t xml:space="preserve">A subsequent minimal attention-based system was used for cross-architecture diagnosis. It is Transformer-style in the limited sense that it uses an attention block over synthetic tokens, but it is not a language model. It contains optional workspace-like memory and optional action-outcome loops. The purpose was not to model production language models or subjective report, but to test whether the same manipulations behave similarly in an attention-based substrate.</w:t>
+      </w:r>
+    </w:p>
+    <w:p>
+      <w:pPr>
+        <w:pStyle w:val="BodyText"/>
+      </w:pPr>
+      <w:r>
+        <w:t xml:space="preserve">The attention-based follow-up crossed workspace availability with action-loop availability using the same notation as the thalamus factorial design:</w:t>
       </w:r>
     </w:p>
     <w:p>
@@ -417,7 +425,7 @@
         <w:pStyle w:val="FirstParagraph"/>
       </w:pPr>
       <w:r>
-        <w:t xml:space="preserve">Additional Transformer diagnostics varied action-effect noise, action-loop learning rate, and workspace strength. These diagnostics were treated as measurement probes rather than part of the primary validation set.</w:t>
+        <w:t xml:space="preserve">Additional attention-substrate diagnostics varied action-effect noise, action-loop learning rate, and workspace strength. These diagnostics were treated as measurement probes rather than part of the primary validation set.</w:t>
       </w:r>
     </w:p>
     <w:bookmarkEnd w:id="15"/>
@@ -534,7 +542,423 @@
         <w:pStyle w:val="FirstParagraph"/>
       </w:pPr>
       <w:r>
-        <w:t xml:space="preserve">Agency-related independent tests included:</w:t>
+        <w:t xml:space="preserve">Independent tests were designed to avoid reusing the proxy column as the dependent variable. Agency-related tests included four behavior-level probes. The intentional-binding analogue measured whether systems compressed the interval between an initiated action and its predicted effect, following the logic of intentional binding tasks. The error-attribution test measured whether prediction errors were assigned to self-generated versus externally imposed actions. The controllability-preference test measured whether systems preferred environments in which their actions reliably changed outcomes. The forced-action probe measured whether agency scores dropped when actions were externally selected while observations remained available.</w:t>
+      </w:r>
+    </w:p>
+    <w:p>
+      <w:pPr>
+        <w:pStyle w:val="BodyText"/>
+      </w:pPr>
+      <w:r>
+        <w:t xml:space="preserve">Self-related tests used perturbation and discrimination probes. Boundary perturbation measured recovery after perturbing self-marked versus non-self-marked state components. Self/other discrimination measured whether a system could distinguish its own state or action traces from matched traces generated by another system. The computational mirror test measured delayed or transformed self-recognition from previous behavior traces rather than from current internal state alone. Ownership attribution measured whether a system assigned observed outcomes to its own prior actions when competing external causes were present.</w:t>
+      </w:r>
+    </w:p>
+    <w:p>
+      <w:pPr>
+        <w:pStyle w:val="BodyText"/>
+      </w:pPr>
+      <w:r>
+        <w:t xml:space="preserve">Measurement-strengthening tests were added after diagnosis. Delayed identity recognition tested whether an identity marker remained recognizable after intervening dynamics. Temporal-binding probes tested whether separated events could be ordered or bound into a coherent sequence. Forced-choice ownership presented one self-generated action and one externally generated action and scored selection accuracy. Ownership-illusion resistance measured whether a system rejected externally generated outcomes when they conflicted with its own action predictions. Distributed hard probes included meta-monitor lesion, hidden-agent perturbation, and body-schema update tests; graded meta-monitor strength, noise, and delay controls tested whether hard-probe scores tracked functional meta-monitor quality rather than module presence alone.</w:t>
+      </w:r>
+    </w:p>
+    <w:bookmarkEnd w:id="18"/>
+    <w:bookmarkStart w:id="19" w:name="refined-operational-constructs"/>
+    <w:p>
+      <w:pPr>
+        <w:pStyle w:val="Heading2"/>
+      </w:pPr>
+      <w:r>
+        <w:t xml:space="preserve">2.4 Refined Operational Constructs</w:t>
+      </w:r>
+    </w:p>
+    <w:p>
+      <w:pPr>
+        <w:pStyle w:val="FirstParagraph"/>
+      </w:pPr>
+      <w:r>
+        <w:t xml:space="preserve">All refined scores are normalized to</w:t>
+      </w:r>
+      <w:r>
+        <w:t xml:space="preserve"> </w:t>
+      </w:r>
+      <w:r>
+        <w:rPr>
+          <w:rStyle w:val="VerbatimChar"/>
+        </w:rPr>
+        <w:t xml:space="preserve">[0, 1]</w:t>
+      </w:r>
+      <w:r>
+        <w:t xml:space="preserve">, with larger values indicating stronger expression of the operational construct. A construct was treated as validated when its proxy and independent-test scores showed stable positive convergence, using</w:t>
+      </w:r>
+      <w:r>
+        <w:t xml:space="preserve"> </w:t>
+      </w:r>
+      <w:r>
+        <w:rPr>
+          <w:rStyle w:val="VerbatimChar"/>
+        </w:rPr>
+        <w:t xml:space="preserve">r &gt;= 0.7</w:t>
+      </w:r>
+      <w:r>
+        <w:t xml:space="preserve"> </w:t>
+      </w:r>
+      <w:r>
+        <w:t xml:space="preserve">as the working threshold together with inspection of confidence intervals and condition-level behavior. Results in the intermediate range (</w:t>
+      </w:r>
+      <w:r>
+        <w:rPr>
+          <w:rStyle w:val="VerbatimChar"/>
+        </w:rPr>
+        <w:t xml:space="preserve">0.5 &lt;= r &lt; 0.7</w:t>
+      </w:r>
+      <w:r>
+        <w:t xml:space="preserve">) were treated as exploratory pending additional probes, while weaker or reversed relationships triggered diagnosis. The final five validated constructs are summarized below.</w:t>
+      </w:r>
+    </w:p>
+    <w:tbl>
+      <w:tblPr>
+        <w:tblStyle w:val="Table"/>
+        <w:tblW w:type="pct" w:w="5000"/>
+        <w:tblLayout w:type="fixed"/>
+        <w:tblLook w:firstRow="1" w:lastRow="0" w:firstColumn="0" w:lastColumn="0" w:noHBand="0" w:noVBand="0" w:val="0020"/>
+      </w:tblPr>
+      <w:tblGrid>
+        <w:gridCol w:w="1980"/>
+        <w:gridCol w:w="1980"/>
+        <w:gridCol w:w="1980"/>
+        <w:gridCol w:w="1980"/>
+      </w:tblGrid>
+      <w:tr>
+        <w:trPr>
+          <w:tblHeader w:val="on"/>
+        </w:trPr>
+        <w:tc>
+          <w:tcPr/>
+          <w:p>
+            <w:pPr>
+              <w:pStyle w:val="Compact"/>
+            </w:pPr>
+            <w:r>
+              <w:t xml:space="preserve">Construct</w:t>
+            </w:r>
+          </w:p>
+        </w:tc>
+        <w:tc>
+          <w:tcPr/>
+          <w:p>
+            <w:pPr>
+              <w:pStyle w:val="Compact"/>
+            </w:pPr>
+            <w:r>
+              <w:t xml:space="preserve">Proxy score</w:t>
+            </w:r>
+          </w:p>
+        </w:tc>
+        <w:tc>
+          <w:tcPr/>
+          <w:p>
+            <w:pPr>
+              <w:pStyle w:val="Compact"/>
+            </w:pPr>
+            <w:r>
+              <w:t xml:space="preserve">Independent tests</w:t>
+            </w:r>
+          </w:p>
+        </w:tc>
+        <w:tc>
+          <w:tcPr/>
+          <w:p>
+            <w:pPr>
+              <w:pStyle w:val="Compact"/>
+            </w:pPr>
+            <w:r>
+              <w:t xml:space="preserve">Hypothesized mechanism</w:t>
+            </w:r>
+          </w:p>
+        </w:tc>
+      </w:tr>
+      <w:tr>
+        <w:tc>
+          <w:tcPr/>
+          <w:p>
+            <w:pPr>
+              <w:pStyle w:val="Compact"/>
+            </w:pPr>
+            <w:r>
+              <w:t xml:space="preserve">Action agency</w:t>
+            </w:r>
+          </w:p>
+        </w:tc>
+        <w:tc>
+          <w:tcPr/>
+          <w:p>
+            <w:pPr>
+              <w:pStyle w:val="Compact"/>
+            </w:pPr>
+            <w:r>
+              <w:t xml:space="preserve">action-outcome prediction/control score after separating gating from control</w:t>
+            </w:r>
+          </w:p>
+        </w:tc>
+        <w:tc>
+          <w:tcPr/>
+          <w:p>
+            <w:pPr>
+              <w:pStyle w:val="Compact"/>
+            </w:pPr>
+            <w:r>
+              <w:t xml:space="preserve">intentional-binding analogue, error attribution, controllability preference, forced-action probes</w:t>
+            </w:r>
+          </w:p>
+        </w:tc>
+        <w:tc>
+          <w:tcPr/>
+          <w:p>
+            <w:pPr>
+              <w:pStyle w:val="Compact"/>
+            </w:pPr>
+            <w:r>
+              <w:t xml:space="preserve">action-outcome loop</w:t>
+            </w:r>
+          </w:p>
+        </w:tc>
+      </w:tr>
+      <w:tr>
+        <w:tc>
+          <w:tcPr/>
+          <w:p>
+            <w:pPr>
+              <w:pStyle w:val="Compact"/>
+            </w:pPr>
+            <w:r>
+              <w:t xml:space="preserve">Boundary self</w:t>
+            </w:r>
+          </w:p>
+        </w:tc>
+        <w:tc>
+          <w:tcPr/>
+          <w:p>
+            <w:pPr>
+              <w:pStyle w:val="Compact"/>
+            </w:pPr>
+            <w:r>
+              <w:t xml:space="preserve">boundary-maintenance proxy derived from workspace-supported self-boundary stability</w:t>
+            </w:r>
+          </w:p>
+        </w:tc>
+        <w:tc>
+          <w:tcPr/>
+          <w:p>
+            <w:pPr>
+              <w:pStyle w:val="Compact"/>
+            </w:pPr>
+            <w:r>
+              <w:t xml:space="preserve">boundary perturbation and self/other discrimination probes</w:t>
+            </w:r>
+          </w:p>
+        </w:tc>
+        <w:tc>
+          <w:tcPr/>
+          <w:p>
+            <w:pPr>
+              <w:pStyle w:val="Compact"/>
+            </w:pPr>
+            <w:r>
+              <w:t xml:space="preserve">workspace</w:t>
+            </w:r>
+          </w:p>
+        </w:tc>
+      </w:tr>
+      <w:tr>
+        <w:tc>
+          <w:tcPr/>
+          <w:p>
+            <w:pPr>
+              <w:pStyle w:val="Compact"/>
+            </w:pPr>
+            <w:r>
+              <w:t xml:space="preserve">Identity-temporal self</w:t>
+            </w:r>
+          </w:p>
+        </w:tc>
+        <w:tc>
+          <w:tcPr/>
+          <w:p>
+            <w:pPr>
+              <w:pStyle w:val="Compact"/>
+            </w:pPr>
+            <w:r>
+              <w:t xml:space="preserve">identity-marker persistence proxy</w:t>
+            </w:r>
+          </w:p>
+        </w:tc>
+        <w:tc>
+          <w:tcPr/>
+          <w:p>
+            <w:pPr>
+              <w:pStyle w:val="Compact"/>
+            </w:pPr>
+            <w:r>
+              <w:t xml:space="preserve">delayed identity recognition and temporal-binding probes</w:t>
+            </w:r>
+          </w:p>
+        </w:tc>
+        <w:tc>
+          <w:tcPr/>
+          <w:p>
+            <w:pPr>
+              <w:pStyle w:val="Compact"/>
+            </w:pPr>
+            <w:r>
+              <w:t xml:space="preserve">workspace</w:t>
+            </w:r>
+          </w:p>
+        </w:tc>
+      </w:tr>
+      <w:tr>
+        <w:tc>
+          <w:tcPr/>
+          <w:p>
+            <w:pPr>
+              <w:pStyle w:val="Compact"/>
+            </w:pPr>
+            <w:r>
+              <w:t xml:space="preserve">Action ownership</w:t>
+            </w:r>
+          </w:p>
+        </w:tc>
+        <w:tc>
+          <w:tcPr/>
+          <w:p>
+            <w:pPr>
+              <w:pStyle w:val="Compact"/>
+            </w:pPr>
+            <w:r>
+              <w:t xml:space="preserve">action-attribution proxy</w:t>
+            </w:r>
+          </w:p>
+        </w:tc>
+        <w:tc>
+          <w:tcPr/>
+          <w:p>
+            <w:pPr>
+              <w:pStyle w:val="Compact"/>
+            </w:pPr>
+            <w:r>
+              <w:t xml:space="preserve">forced-choice ownership and ownership-illusion resistance probes</w:t>
+            </w:r>
+          </w:p>
+        </w:tc>
+        <w:tc>
+          <w:tcPr/>
+          <w:p>
+            <w:pPr>
+              <w:pStyle w:val="Compact"/>
+            </w:pPr>
+            <w:r>
+              <w:t xml:space="preserve">action-outcome loop</w:t>
+            </w:r>
+          </w:p>
+        </w:tc>
+      </w:tr>
+      <w:tr>
+        <w:tc>
+          <w:tcPr/>
+          <w:p>
+            <w:pPr>
+              <w:pStyle w:val="Compact"/>
+            </w:pPr>
+            <w:r>
+              <w:t xml:space="preserve">Distributed body-schema self</w:t>
+            </w:r>
+          </w:p>
+        </w:tc>
+        <w:tc>
+          <w:tcPr/>
+          <w:p>
+            <w:pPr>
+              <w:pStyle w:val="Compact"/>
+            </w:pPr>
+            <w:r>
+              <w:t xml:space="preserve">meta-monitor/body-schema coherence proxy</w:t>
+            </w:r>
+          </w:p>
+        </w:tc>
+        <w:tc>
+          <w:tcPr/>
+          <w:p>
+            <w:pPr>
+              <w:pStyle w:val="Compact"/>
+            </w:pPr>
+            <w:r>
+              <w:t xml:space="preserve">meta-monitor lesion, hidden-agent perturbation, body-schema update, and graded controls</w:t>
+            </w:r>
+          </w:p>
+        </w:tc>
+        <w:tc>
+          <w:tcPr/>
+          <w:p>
+            <w:pPr>
+              <w:pStyle w:val="Compact"/>
+            </w:pPr>
+            <w:r>
+              <w:t xml:space="preserve">meta-monitor</w:t>
+            </w:r>
+          </w:p>
+        </w:tc>
+      </w:tr>
+    </w:tbl>
+    <w:p>
+      <w:pPr>
+        <w:pStyle w:val="BodyText"/>
+      </w:pPr>
+      <w:r>
+        <w:t xml:space="preserve">These are operational constructs rather than reports of subjective experience. The proxy column and independent-test column are intentionally kept separate in the benchmark package so that future systems can reproduce the validation rather than inherit a pre-combined score. Hypothesized mechanisms are based on prior theory and architectural design; their effects are tested empirically in Section 3.6.</w:t>
+      </w:r>
+    </w:p>
+    <w:bookmarkEnd w:id="19"/>
+    <w:bookmarkStart w:id="23" w:name="diagnostic-protocol"/>
+    <w:p>
+      <w:pPr>
+        <w:pStyle w:val="Heading2"/>
+      </w:pPr>
+      <w:r>
+        <w:t xml:space="preserve">2.5 Diagnostic Protocol</w:t>
+      </w:r>
+    </w:p>
+    <w:p>
+      <w:pPr>
+        <w:pStyle w:val="FirstParagraph"/>
+      </w:pPr>
+      <w:r>
+        <w:t xml:space="preserve">When proxy-test convergence was below the validation threshold, we used a diagnostic-refinement cycle. Reversed relationships (</w:t>
+      </w:r>
+      <w:r>
+        <w:rPr>
+          <w:rStyle w:val="VerbatimChar"/>
+        </w:rPr>
+        <w:t xml:space="preserve">r &lt; 0</w:t>
+      </w:r>
+      <w:r>
+        <w:t xml:space="preserve">) or weak convergence (</w:t>
+      </w:r>
+      <w:r>
+        <w:rPr>
+          <w:rStyle w:val="VerbatimChar"/>
+        </w:rPr>
+        <w:t xml:space="preserve">r &lt; 0.5</w:t>
+      </w:r>
+      <w:r>
+        <w:t xml:space="preserve">) were treated as strong evidence of construct mismatch; intermediate results (</w:t>
+      </w:r>
+      <w:r>
+        <w:rPr>
+          <w:rStyle w:val="VerbatimChar"/>
+        </w:rPr>
+        <w:t xml:space="preserve">0.5 &lt;= r &lt; 0.7</w:t>
+      </w:r>
+      <w:r>
+        <w:t xml:space="preserve">) were retained as exploratory unless additional probes established stable convergence.</w:t>
       </w:r>
     </w:p>
     <w:p>
@@ -546,7 +970,7 @@
         </w:numPr>
       </w:pPr>
       <w:r>
-        <w:t xml:space="preserve">intentional-binding analogue</w:t>
+        <w:t xml:space="preserve">Inspect condition-level failures.</w:t>
       </w:r>
     </w:p>
     <w:p>
@@ -558,7 +982,7 @@
         </w:numPr>
       </w:pPr>
       <w:r>
-        <w:t xml:space="preserve">error-attribution test</w:t>
+        <w:t xml:space="preserve">Measure intermediate variables.</w:t>
       </w:r>
     </w:p>
     <w:p>
@@ -570,7 +994,7 @@
         </w:numPr>
       </w:pPr>
       <w:r>
-        <w:t xml:space="preserve">controllability-preference test</w:t>
+        <w:t xml:space="preserve">Identify which variable the proxy actually tracks.</w:t>
       </w:r>
     </w:p>
     <w:p>
@@ -582,15 +1006,7 @@
         </w:numPr>
       </w:pPr>
       <w:r>
-        <w:t xml:space="preserve">forced-action probe</w:t>
-      </w:r>
-    </w:p>
-    <w:p>
-      <w:pPr>
-        <w:pStyle w:val="FirstParagraph"/>
-      </w:pPr>
-      <w:r>
-        <w:t xml:space="preserve">Self-related tests included:</w:t>
+        <w:t xml:space="preserve">Split conflated constructs.</w:t>
       </w:r>
     </w:p>
     <w:p>
@@ -598,11 +1014,11 @@
         <w:pStyle w:val="Compact"/>
         <w:numPr>
           <w:ilvl w:val="0"/>
-          <w:numId w:val="1005"/>
+          <w:numId w:val="1004"/>
         </w:numPr>
       </w:pPr>
       <w:r>
-        <w:t xml:space="preserve">boundary perturbation</w:t>
+        <w:t xml:space="preserve">Re-validate each refined construct.</w:t>
       </w:r>
     </w:p>
     <w:p>
@@ -610,384 +1026,7 @@
         <w:pStyle w:val="Compact"/>
         <w:numPr>
           <w:ilvl w:val="0"/>
-          <w:numId w:val="1005"/>
-        </w:numPr>
-      </w:pPr>
-      <w:r>
-        <w:t xml:space="preserve">computational mirror test</w:t>
-      </w:r>
-    </w:p>
-    <w:p>
-      <w:pPr>
-        <w:pStyle w:val="Compact"/>
-        <w:numPr>
-          <w:ilvl w:val="0"/>
-          <w:numId w:val="1005"/>
-        </w:numPr>
-      </w:pPr>
-      <w:r>
-        <w:t xml:space="preserve">ownership attribution</w:t>
-      </w:r>
-    </w:p>
-    <w:p>
-      <w:pPr>
-        <w:pStyle w:val="Compact"/>
-        <w:numPr>
-          <w:ilvl w:val="0"/>
-          <w:numId w:val="1005"/>
-        </w:numPr>
-      </w:pPr>
-      <w:r>
-        <w:t xml:space="preserve">architecture-specific self probe</w:t>
-      </w:r>
-    </w:p>
-    <w:p>
-      <w:pPr>
-        <w:pStyle w:val="FirstParagraph"/>
-      </w:pPr>
-      <w:r>
-        <w:t xml:space="preserve">Additional measurement-strengthening tests were added after diagnosis:</w:t>
-      </w:r>
-    </w:p>
-    <w:p>
-      <w:pPr>
-        <w:pStyle w:val="Compact"/>
-        <w:numPr>
-          <w:ilvl w:val="0"/>
-          <w:numId w:val="1006"/>
-        </w:numPr>
-      </w:pPr>
-      <w:r>
-        <w:t xml:space="preserve">delayed identity recognition</w:t>
-      </w:r>
-    </w:p>
-    <w:p>
-      <w:pPr>
-        <w:pStyle w:val="Compact"/>
-        <w:numPr>
-          <w:ilvl w:val="0"/>
-          <w:numId w:val="1006"/>
-        </w:numPr>
-      </w:pPr>
-      <w:r>
-        <w:t xml:space="preserve">identity marker persistence</w:t>
-      </w:r>
-    </w:p>
-    <w:p>
-      <w:pPr>
-        <w:pStyle w:val="Compact"/>
-        <w:numPr>
-          <w:ilvl w:val="0"/>
-          <w:numId w:val="1006"/>
-        </w:numPr>
-      </w:pPr>
-      <w:r>
-        <w:t xml:space="preserve">transformed mirror test</w:t>
-      </w:r>
-    </w:p>
-    <w:p>
-      <w:pPr>
-        <w:pStyle w:val="Compact"/>
-        <w:numPr>
-          <w:ilvl w:val="0"/>
-          <w:numId w:val="1006"/>
-        </w:numPr>
-      </w:pPr>
-      <w:r>
-        <w:t xml:space="preserve">temporal binding test</w:t>
-      </w:r>
-    </w:p>
-    <w:p>
-      <w:pPr>
-        <w:pStyle w:val="Compact"/>
-        <w:numPr>
-          <w:ilvl w:val="0"/>
-          <w:numId w:val="1006"/>
-        </w:numPr>
-      </w:pPr>
-      <w:r>
-        <w:t xml:space="preserve">forced-choice ownership</w:t>
-      </w:r>
-    </w:p>
-    <w:p>
-      <w:pPr>
-        <w:pStyle w:val="Compact"/>
-        <w:numPr>
-          <w:ilvl w:val="0"/>
-          <w:numId w:val="1006"/>
-        </w:numPr>
-      </w:pPr>
-      <w:r>
-        <w:t xml:space="preserve">ownership illusion resistance</w:t>
-      </w:r>
-    </w:p>
-    <w:p>
-      <w:pPr>
-        <w:pStyle w:val="Compact"/>
-        <w:numPr>
-          <w:ilvl w:val="0"/>
-          <w:numId w:val="1006"/>
-        </w:numPr>
-      </w:pPr>
-      <w:r>
-        <w:t xml:space="preserve">meta-monitor lesion</w:t>
-      </w:r>
-    </w:p>
-    <w:p>
-      <w:pPr>
-        <w:pStyle w:val="Compact"/>
-        <w:numPr>
-          <w:ilvl w:val="0"/>
-          <w:numId w:val="1006"/>
-        </w:numPr>
-      </w:pPr>
-      <w:r>
-        <w:t xml:space="preserve">hidden-agent perturbation</w:t>
-      </w:r>
-    </w:p>
-    <w:p>
-      <w:pPr>
-        <w:pStyle w:val="Compact"/>
-        <w:numPr>
-          <w:ilvl w:val="0"/>
-          <w:numId w:val="1006"/>
-        </w:numPr>
-      </w:pPr>
-      <w:r>
-        <w:t xml:space="preserve">body-schema update probe</w:t>
-      </w:r>
-    </w:p>
-    <w:p>
-      <w:pPr>
-        <w:pStyle w:val="Compact"/>
-        <w:numPr>
-          <w:ilvl w:val="0"/>
-          <w:numId w:val="1006"/>
-        </w:numPr>
-      </w:pPr>
-      <w:r>
-        <w:t xml:space="preserve">graded meta-monitor strength/noise/delay controls</w:t>
-      </w:r>
-    </w:p>
-    <w:bookmarkEnd w:id="18"/>
-    <w:bookmarkStart w:id="19" w:name="refined-operational-constructs"/>
-    <w:p>
-      <w:pPr>
-        <w:pStyle w:val="Heading2"/>
-      </w:pPr>
-      <w:r>
-        <w:t xml:space="preserve">2.4 Refined Operational Constructs</w:t>
-      </w:r>
-    </w:p>
-    <w:p>
-      <w:pPr>
-        <w:pStyle w:val="FirstParagraph"/>
-      </w:pPr>
-      <w:r>
-        <w:t xml:space="preserve">All refined scores are normalized to</w:t>
-      </w:r>
-      <w:r>
-        <w:t xml:space="preserve"> </w:t>
-      </w:r>
-      <w:r>
-        <w:rPr>
-          <w:rStyle w:val="VerbatimChar"/>
-        </w:rPr>
-        <w:t xml:space="preserve">[0, 1]</w:t>
-      </w:r>
-      <w:r>
-        <w:t xml:space="preserve">, with larger values indicating stronger expression of the operational construct. A construct was treated as validated when its proxy and independent-test scores showed stable positive convergence, using</w:t>
-      </w:r>
-      <w:r>
-        <w:t xml:space="preserve"> </w:t>
-      </w:r>
-      <w:r>
-        <w:rPr>
-          <w:rStyle w:val="VerbatimChar"/>
-        </w:rPr>
-        <w:t xml:space="preserve">r &gt;= 0.7</w:t>
-      </w:r>
-      <w:r>
-        <w:t xml:space="preserve"> </w:t>
-      </w:r>
-      <w:r>
-        <w:t xml:space="preserve">as the working threshold together with inspection of confidence intervals and condition-level behavior. Results in the intermediate range (</w:t>
-      </w:r>
-      <w:r>
-        <w:rPr>
-          <w:rStyle w:val="VerbatimChar"/>
-        </w:rPr>
-        <w:t xml:space="preserve">0.5 &lt;= r &lt; 0.7</w:t>
-      </w:r>
-      <w:r>
-        <w:t xml:space="preserve">) were treated as exploratory pending additional probes, while weaker or reversed relationships triggered diagnosis. The final five validated constructs are summarized below.</w:t>
-      </w:r>
-    </w:p>
-    <w:p>
-      <w:pPr>
-        <w:pStyle w:val="BodyText"/>
-      </w:pPr>
-      <w:r>
-        <w:t xml:space="preserve">Construct | Proxy score | Independent tests | Hypothesized mechanism |</w:t>
-      </w:r>
-    </w:p>
-    <w:p>
-      <w:pPr>
-        <w:pStyle w:val="BodyText"/>
-      </w:pPr>
-      <w:r>
-        <w:t xml:space="preserve">|–-|–-|–-|–-|</w:t>
-      </w:r>
-      <w:r>
-        <w:t xml:space="preserve"> </w:t>
-      </w:r>
-      <w:r>
-        <w:t xml:space="preserve">| Action agency | action-outcome prediction/control score after separating gating from control | intentional-binding analogue, error attribution, controllability preference, forced-action probes | action-outcome loop |</w:t>
-      </w:r>
-      <w:r>
-        <w:t xml:space="preserve"> </w:t>
-      </w:r>
-      <w:r>
-        <w:t xml:space="preserve">| Boundary self | boundary-maintenance proxy derived from workspace-supported self-boundary stability | boundary perturbation and self/other discrimination probes | workspace |</w:t>
-      </w:r>
-      <w:r>
-        <w:t xml:space="preserve"> </w:t>
-      </w:r>
-      <w:r>
-        <w:t xml:space="preserve">| Identity-temporal self | identity-marker persistence proxy | delayed identity recognition and temporal-binding probes | workspace |</w:t>
-      </w:r>
-      <w:r>
-        <w:t xml:space="preserve"> </w:t>
-      </w:r>
-      <w:r>
-        <w:t xml:space="preserve">| Action ownership | action-attribution proxy | forced-choice ownership and ownership-illusion resistance probes | action-outcome loop |</w:t>
-      </w:r>
-      <w:r>
-        <w:t xml:space="preserve"> </w:t>
-      </w:r>
-      <w:r>
-        <w:t xml:space="preserve">| Distributed body-schema self | meta-monitor/body-schema coherence proxy | meta-monitor lesion, hidden-agent perturbation, body-schema update, and graded controls | meta-monitor |</w:t>
-      </w:r>
-    </w:p>
-    <w:p>
-      <w:pPr>
-        <w:pStyle w:val="BodyText"/>
-      </w:pPr>
-      <w:r>
-        <w:t xml:space="preserve">These are operational constructs rather than reports of subjective experience. The proxy column and independent-test column are intentionally kept separate in the benchmark package so that future systems can reproduce the validation rather than inherit a pre-combined score. Hypothesized mechanisms are based on prior theory and architectural design; their effects are tested empirically in Section 3.6.</w:t>
-      </w:r>
-    </w:p>
-    <w:bookmarkEnd w:id="19"/>
-    <w:bookmarkStart w:id="23" w:name="diagnostic-protocol"/>
-    <w:p>
-      <w:pPr>
-        <w:pStyle w:val="Heading2"/>
-      </w:pPr>
-      <w:r>
-        <w:t xml:space="preserve">2.5 Diagnostic Protocol</w:t>
-      </w:r>
-    </w:p>
-    <w:p>
-      <w:pPr>
-        <w:pStyle w:val="FirstParagraph"/>
-      </w:pPr>
-      <w:r>
-        <w:t xml:space="preserve">When proxy-test convergence was below the validation threshold, we used a diagnostic-refinement cycle. Reversed relationships (</w:t>
-      </w:r>
-      <w:r>
-        <w:rPr>
-          <w:rStyle w:val="VerbatimChar"/>
-        </w:rPr>
-        <w:t xml:space="preserve">r &lt; 0</w:t>
-      </w:r>
-      <w:r>
-        <w:t xml:space="preserve">) or weak convergence (</w:t>
-      </w:r>
-      <w:r>
-        <w:rPr>
-          <w:rStyle w:val="VerbatimChar"/>
-        </w:rPr>
-        <w:t xml:space="preserve">r &lt; 0.5</w:t>
-      </w:r>
-      <w:r>
-        <w:t xml:space="preserve">) were treated as strong evidence of construct mismatch; intermediate results (</w:t>
-      </w:r>
-      <w:r>
-        <w:rPr>
-          <w:rStyle w:val="VerbatimChar"/>
-        </w:rPr>
-        <w:t xml:space="preserve">0.5 &lt;= r &lt; 0.7</w:t>
-      </w:r>
-      <w:r>
-        <w:t xml:space="preserve">) were retained as exploratory unless additional probes established stable convergence.</w:t>
-      </w:r>
-    </w:p>
-    <w:p>
-      <w:pPr>
-        <w:pStyle w:val="Compact"/>
-        <w:numPr>
-          <w:ilvl w:val="0"/>
-          <w:numId w:val="1007"/>
-        </w:numPr>
-      </w:pPr>
-      <w:r>
-        <w:t xml:space="preserve">Inspect condition-level failures.</w:t>
-      </w:r>
-    </w:p>
-    <w:p>
-      <w:pPr>
-        <w:pStyle w:val="Compact"/>
-        <w:numPr>
-          <w:ilvl w:val="0"/>
-          <w:numId w:val="1007"/>
-        </w:numPr>
-      </w:pPr>
-      <w:r>
-        <w:t xml:space="preserve">Measure intermediate variables.</w:t>
-      </w:r>
-    </w:p>
-    <w:p>
-      <w:pPr>
-        <w:pStyle w:val="Compact"/>
-        <w:numPr>
-          <w:ilvl w:val="0"/>
-          <w:numId w:val="1007"/>
-        </w:numPr>
-      </w:pPr>
-      <w:r>
-        <w:t xml:space="preserve">Identify which variable the proxy actually tracks.</w:t>
-      </w:r>
-    </w:p>
-    <w:p>
-      <w:pPr>
-        <w:pStyle w:val="Compact"/>
-        <w:numPr>
-          <w:ilvl w:val="0"/>
-          <w:numId w:val="1007"/>
-        </w:numPr>
-      </w:pPr>
-      <w:r>
-        <w:t xml:space="preserve">Split conflated constructs.</w:t>
-      </w:r>
-    </w:p>
-    <w:p>
-      <w:pPr>
-        <w:pStyle w:val="Compact"/>
-        <w:numPr>
-          <w:ilvl w:val="0"/>
-          <w:numId w:val="1007"/>
-        </w:numPr>
-      </w:pPr>
-      <w:r>
-        <w:t xml:space="preserve">Re-validate each refined construct.</w:t>
-      </w:r>
-    </w:p>
-    <w:p>
-      <w:pPr>
-        <w:pStyle w:val="Compact"/>
-        <w:numPr>
-          <w:ilvl w:val="0"/>
-          <w:numId w:val="1007"/>
+          <w:numId w:val="1004"/>
         </w:numPr>
       </w:pPr>
       <w:r>
@@ -1019,7 +1058,7 @@
           <wp:inline>
             <wp:extent cx="5067300" cy="3145162"/>
             <wp:effectExtent b="0" l="0" r="0" t="0"/>
-            <wp:docPr descr="Figure 1. Validation-diagnosis-refinement workflow." title="" id="21" name="Picture"/>
+            <wp:docPr descr="Validation-diagnosis-refinement workflow." title="" id="21" name="Picture"/>
             <a:graphic>
               <a:graphicData uri="http://schemas.openxmlformats.org/drawingml/2006/picture">
                 <pic:pic>
@@ -1062,7 +1101,7 @@
         <w:pStyle w:val="ImageCaption"/>
       </w:pPr>
       <w:r>
-        <w:t xml:space="preserve">Figure 1. Validation-diagnosis-refinement workflow.</w:t>
+        <w:t xml:space="preserve">Validation-diagnosis-refinement workflow.</w:t>
       </w:r>
     </w:p>
     <w:bookmarkEnd w:id="23"/>
@@ -1088,7 +1127,7 @@
         <w:pStyle w:val="Compact"/>
         <w:numPr>
           <w:ilvl w:val="0"/>
-          <w:numId w:val="1008"/>
+          <w:numId w:val="1005"/>
         </w:numPr>
       </w:pPr>
       <w:r>
@@ -1100,7 +1139,7 @@
         <w:pStyle w:val="Compact"/>
         <w:numPr>
           <w:ilvl w:val="0"/>
-          <w:numId w:val="1008"/>
+          <w:numId w:val="1005"/>
         </w:numPr>
       </w:pPr>
       <w:r>
@@ -1112,7 +1151,7 @@
         <w:pStyle w:val="Compact"/>
         <w:numPr>
           <w:ilvl w:val="0"/>
-          <w:numId w:val="1008"/>
+          <w:numId w:val="1005"/>
         </w:numPr>
       </w:pPr>
       <w:r>
@@ -1124,7 +1163,7 @@
         <w:pStyle w:val="Compact"/>
         <w:numPr>
           <w:ilvl w:val="0"/>
-          <w:numId w:val="1008"/>
+          <w:numId w:val="1005"/>
         </w:numPr>
       </w:pPr>
       <w:r>
@@ -1144,7 +1183,7 @@
         <w:pStyle w:val="BodyText"/>
       </w:pPr>
       <w:r>
-        <w:t xml:space="preserve">Transformer follow-up analyses are explicitly assigned to the exploratory or measurement-limited tiers. They are used to test generalization and expose architecture-specific measurement failures, not to expand the primary validated construct set.</w:t>
+        <w:t xml:space="preserve">Minimal attention-based follow-up analyses are explicitly assigned to the exploratory or measurement-limited tiers. They are used to test generalization and expose architecture-specific measurement failures, not to expand the primary validated construct set.</w:t>
       </w:r>
     </w:p>
     <w:bookmarkEnd w:id="24"/>
@@ -1259,7 +1298,7 @@
         <w:pStyle w:val="BodyText"/>
       </w:pPr>
       <w:r>
-        <w:t xml:space="preserve">Transformer follow-up analyses use the same correlation-based reporting but are not included in the primary validation tables. Their role is diagnostic: they test whether mechanism effects and measurement validity behave similarly in an attention-based substrate.</w:t>
+        <w:t xml:space="preserve">Minimal attention-based follow-up analyses use the same correlation-based reporting but are not included in the primary validation tables. Their role is diagnostic: they test whether mechanism effects and measurement validity behave similarly in an attention-based substrate.</w:t>
       </w:r>
     </w:p>
     <w:bookmarkEnd w:id="25"/>
@@ -1324,7 +1363,7 @@
         <w:pStyle w:val="Compact"/>
         <w:numPr>
           <w:ilvl w:val="0"/>
-          <w:numId w:val="1009"/>
+          <w:numId w:val="1006"/>
         </w:numPr>
       </w:pPr>
       <w:r>
@@ -1339,7 +1378,7 @@
         <w:pStyle w:val="Compact"/>
         <w:numPr>
           <w:ilvl w:val="0"/>
-          <w:numId w:val="1009"/>
+          <w:numId w:val="1006"/>
         </w:numPr>
       </w:pPr>
       <w:r>
@@ -1354,7 +1393,7 @@
         <w:pStyle w:val="Compact"/>
         <w:numPr>
           <w:ilvl w:val="0"/>
-          <w:numId w:val="1009"/>
+          <w:numId w:val="1006"/>
         </w:numPr>
       </w:pPr>
       <w:r>
@@ -1369,7 +1408,7 @@
         <w:pStyle w:val="Compact"/>
         <w:numPr>
           <w:ilvl w:val="0"/>
-          <w:numId w:val="1009"/>
+          <w:numId w:val="1006"/>
         </w:numPr>
       </w:pPr>
       <w:r>
@@ -1384,7 +1423,7 @@
         <w:pStyle w:val="Compact"/>
         <w:numPr>
           <w:ilvl w:val="0"/>
-          <w:numId w:val="1009"/>
+          <w:numId w:val="1006"/>
         </w:numPr>
       </w:pPr>
       <w:r>
@@ -1426,7 +1465,7 @@
         <w:t xml:space="preserve">docs/paper/figures/paper_v2_20260521</w:t>
       </w:r>
       <w:r>
-        <w:t xml:space="preserve">. The Transformer diagnostic figure is generated by</w:t>
+        <w:t xml:space="preserve">. The minimal attention diagnostic figure is generated by</w:t>
       </w:r>
       <w:r>
         <w:t xml:space="preserve"> </w:t>
@@ -1621,7 +1660,7 @@
           <wp:inline>
             <wp:extent cx="5067300" cy="4300446"/>
             <wp:effectExtent b="0" l="0" r="0" t="0"/>
-            <wp:docPr descr="Figure 2. Three diagnostic-refinement cycles." title="" id="29" name="Picture"/>
+            <wp:docPr descr="Three diagnostic-refinement cycles." title="" id="29" name="Picture"/>
             <a:graphic>
               <a:graphicData uri="http://schemas.openxmlformats.org/drawingml/2006/picture">
                 <pic:pic>
@@ -1664,7 +1703,7 @@
         <w:pStyle w:val="ImageCaption"/>
       </w:pPr>
       <w:r>
-        <w:t xml:space="preserve">Figure 2. Three diagnostic-refinement cycles.</w:t>
+        <w:t xml:space="preserve">Three diagnostic-refinement cycles.</w:t>
       </w:r>
     </w:p>
     <w:bookmarkEnd w:id="31"/>
@@ -1683,6 +1722,192 @@
       </w:pPr>
       <w:r>
         <w:t xml:space="preserve">The original agency proxy conflated information selection with behavioral control. We split it into:</w:t>
+      </w:r>
+    </w:p>
+    <w:p>
+      <w:pPr>
+        <w:pStyle w:val="Compact"/>
+        <w:numPr>
+          <w:ilvl w:val="0"/>
+          <w:numId w:val="1007"/>
+        </w:numPr>
+      </w:pPr>
+      <w:r>
+        <w:rPr>
+          <w:rStyle w:val="VerbatimChar"/>
+        </w:rPr>
+        <w:t xml:space="preserve">gating_coordination_proxy</w:t>
+      </w:r>
+      <w:r>
+        <w:t xml:space="preserve">: information selection and gating</w:t>
+      </w:r>
+    </w:p>
+    <w:p>
+      <w:pPr>
+        <w:pStyle w:val="Compact"/>
+        <w:numPr>
+          <w:ilvl w:val="0"/>
+          <w:numId w:val="1007"/>
+        </w:numPr>
+      </w:pPr>
+      <w:r>
+        <w:rPr>
+          <w:rStyle w:val="VerbatimChar"/>
+        </w:rPr>
+        <w:t xml:space="preserve">action_agency_proxy</w:t>
+      </w:r>
+      <w:r>
+        <w:t xml:space="preserve">: action-outcome prediction and control</w:t>
+      </w:r>
+    </w:p>
+    <w:p>
+      <w:pPr>
+        <w:pStyle w:val="Compact"/>
+        <w:numPr>
+          <w:ilvl w:val="0"/>
+          <w:numId w:val="1007"/>
+        </w:numPr>
+      </w:pPr>
+      <w:r>
+        <w:rPr>
+          <w:rStyle w:val="VerbatimChar"/>
+        </w:rPr>
+        <w:t xml:space="preserve">legacy_agency_proxy</w:t>
+      </w:r>
+      <w:r>
+        <w:t xml:space="preserve">: retained for auditability</w:t>
+      </w:r>
+    </w:p>
+    <w:p>
+      <w:pPr>
+        <w:pStyle w:val="FirstParagraph"/>
+      </w:pPr>
+      <w:r>
+        <w:t xml:space="preserve">After correction, action-agency proxy-test convergence improved from negative correlation in thalamus systems to strong positive convergence overall:</w:t>
+      </w:r>
+    </w:p>
+    <w:p>
+      <w:pPr>
+        <w:pStyle w:val="Compact"/>
+        <w:numPr>
+          <w:ilvl w:val="0"/>
+          <w:numId w:val="1008"/>
+        </w:numPr>
+      </w:pPr>
+      <w:r>
+        <w:t xml:space="preserve">action agency:</w:t>
+      </w:r>
+      <w:r>
+        <w:t xml:space="preserve"> </w:t>
+      </w:r>
+      <w:r>
+        <w:rPr>
+          <w:rStyle w:val="VerbatimChar"/>
+        </w:rPr>
+        <w:t xml:space="preserve">r=0.874</w:t>
+      </w:r>
+      <w:r>
+        <w:t xml:space="preserve">, 95% CI</w:t>
+      </w:r>
+      <w:r>
+        <w:t xml:space="preserve"> </w:t>
+      </w:r>
+      <w:r>
+        <w:rPr>
+          <w:rStyle w:val="VerbatimChar"/>
+        </w:rPr>
+        <w:t xml:space="preserve">[0.774, 0.943]</w:t>
+      </w:r>
+      <w:r>
+        <w:t xml:space="preserve">,</w:t>
+      </w:r>
+      <w:r>
+        <w:t xml:space="preserve"> </w:t>
+      </w:r>
+      <w:r>
+        <w:rPr>
+          <w:rStyle w:val="VerbatimChar"/>
+        </w:rPr>
+        <w:t xml:space="preserve">p=2.4e-08</w:t>
+      </w:r>
+    </w:p>
+    <w:p>
+      <w:pPr>
+        <w:pStyle w:val="FirstParagraph"/>
+      </w:pPr>
+      <w:r>
+        <w:t xml:space="preserve">This preserved the mechanism finding while changing its interpretation: action-outcome loops increased operational agency, whereas workspace alone did not. The original high scores in no-action-loop thalamus systems were therefore not evidence for agency; they were evidence that information gating had been misclassified as agency.</w:t>
+      </w:r>
+    </w:p>
+    <w:bookmarkEnd w:id="32"/>
+    <w:bookmarkStart w:id="33" w:name="self-model-decomposition"/>
+    <w:p>
+      <w:pPr>
+        <w:pStyle w:val="Heading2"/>
+      </w:pPr>
+      <w:r>
+        <w:t xml:space="preserve">3.3 Self-Model Decomposition</w:t>
+      </w:r>
+    </w:p>
+    <w:p>
+      <w:pPr>
+        <w:pStyle w:val="FirstParagraph"/>
+      </w:pPr>
+      <w:r>
+        <w:t xml:space="preserve">The initial self-model proxy mixed multiple operational constructs. Boundary/core self validated strongly:</w:t>
+      </w:r>
+    </w:p>
+    <w:p>
+      <w:pPr>
+        <w:pStyle w:val="Compact"/>
+        <w:numPr>
+          <w:ilvl w:val="0"/>
+          <w:numId w:val="1009"/>
+        </w:numPr>
+      </w:pPr>
+      <w:r>
+        <w:t xml:space="preserve">boundary self:</w:t>
+      </w:r>
+      <w:r>
+        <w:t xml:space="preserve"> </w:t>
+      </w:r>
+      <w:r>
+        <w:rPr>
+          <w:rStyle w:val="VerbatimChar"/>
+        </w:rPr>
+        <w:t xml:space="preserve">r=0.940</w:t>
+      </w:r>
+      <w:r>
+        <w:t xml:space="preserve">, 95% CI</w:t>
+      </w:r>
+      <w:r>
+        <w:t xml:space="preserve"> </w:t>
+      </w:r>
+      <w:r>
+        <w:rPr>
+          <w:rStyle w:val="VerbatimChar"/>
+        </w:rPr>
+        <w:t xml:space="preserve">[0.847, 0.994]</w:t>
+      </w:r>
+      <w:r>
+        <w:t xml:space="preserve">,</w:t>
+      </w:r>
+      <w:r>
+        <w:t xml:space="preserve"> </w:t>
+      </w:r>
+      <w:r>
+        <w:rPr>
+          <w:rStyle w:val="VerbatimChar"/>
+        </w:rPr>
+        <w:t xml:space="preserve">p&lt;1e-9</w:t>
+      </w:r>
+    </w:p>
+    <w:p>
+      <w:pPr>
+        <w:pStyle w:val="FirstParagraph"/>
+      </w:pPr>
+      <w:r>
+        <w:t xml:space="preserve">Temporal self required further splitting. Generic trajectory consistency did not align with refined temporal tests. The validated temporal component was identity persistence:</w:t>
       </w:r>
     </w:p>
     <w:p>
@@ -1694,49 +1919,40 @@
         </w:numPr>
       </w:pPr>
       <w:r>
-        <w:rPr>
-          <w:rStyle w:val="VerbatimChar"/>
-        </w:rPr>
-        <w:t xml:space="preserve">gating_coordination_proxy</w:t>
-      </w:r>
-      <w:r>
-        <w:t xml:space="preserve">: information selection and gating</w:t>
-      </w:r>
-    </w:p>
-    <w:p>
-      <w:pPr>
-        <w:pStyle w:val="Compact"/>
-        <w:numPr>
-          <w:ilvl w:val="0"/>
-          <w:numId w:val="1010"/>
-        </w:numPr>
-      </w:pPr>
-      <w:r>
-        <w:rPr>
-          <w:rStyle w:val="VerbatimChar"/>
-        </w:rPr>
-        <w:t xml:space="preserve">action_agency_proxy</w:t>
-      </w:r>
-      <w:r>
-        <w:t xml:space="preserve">: action-outcome prediction and control</w:t>
-      </w:r>
-    </w:p>
-    <w:p>
-      <w:pPr>
-        <w:pStyle w:val="Compact"/>
-        <w:numPr>
-          <w:ilvl w:val="0"/>
-          <w:numId w:val="1010"/>
-        </w:numPr>
-      </w:pPr>
-      <w:r>
-        <w:rPr>
-          <w:rStyle w:val="VerbatimChar"/>
-        </w:rPr>
-        <w:t xml:space="preserve">legacy_agency_proxy</w:t>
-      </w:r>
-      <w:r>
-        <w:t xml:space="preserve">: retained for auditability</w:t>
+        <w:t xml:space="preserve">identity marker persistence vs delayed identity recognition:</w:t>
+      </w:r>
+      <w:r>
+        <w:t xml:space="preserve"> </w:t>
+      </w:r>
+      <w:r>
+        <w:rPr>
+          <w:rStyle w:val="VerbatimChar"/>
+        </w:rPr>
+        <w:t xml:space="preserve">r=0.850</w:t>
+      </w:r>
+      <w:r>
+        <w:t xml:space="preserve">, 95% CI</w:t>
+      </w:r>
+      <w:r>
+        <w:t xml:space="preserve"> </w:t>
+      </w:r>
+      <w:r>
+        <w:rPr>
+          <w:rStyle w:val="VerbatimChar"/>
+        </w:rPr>
+        <w:t xml:space="preserve">[0.755, 0.912]</w:t>
+      </w:r>
+      <w:r>
+        <w:t xml:space="preserve">,</w:t>
+      </w:r>
+      <w:r>
+        <w:t xml:space="preserve"> </w:t>
+      </w:r>
+      <w:r>
+        <w:rPr>
+          <w:rStyle w:val="VerbatimChar"/>
+        </w:rPr>
+        <w:t xml:space="preserve">p&lt;1e-9</w:t>
       </w:r>
     </w:p>
     <w:p>
@@ -1744,7 +1960,7 @@
         <w:pStyle w:val="FirstParagraph"/>
       </w:pPr>
       <w:r>
-        <w:t xml:space="preserve">After correction, action-agency proxy-test convergence improved from negative correlation in thalamus systems to strong positive convergence overall:</w:t>
+        <w:t xml:space="preserve">Ownership also required splitting. Body ownership remained exploratory, but action ownership validated strongly:</w:t>
       </w:r>
     </w:p>
     <w:p>
@@ -1756,16 +1972,16 @@
         </w:numPr>
       </w:pPr>
       <w:r>
-        <w:t xml:space="preserve">action agency:</w:t>
-      </w:r>
-      <w:r>
-        <w:t xml:space="preserve"> </w:t>
-      </w:r>
-      <w:r>
-        <w:rPr>
-          <w:rStyle w:val="VerbatimChar"/>
-        </w:rPr>
-        <w:t xml:space="preserve">r=0.874</w:t>
+        <w:t xml:space="preserve">action ownership:</w:t>
+      </w:r>
+      <w:r>
+        <w:t xml:space="preserve"> </w:t>
+      </w:r>
+      <w:r>
+        <w:rPr>
+          <w:rStyle w:val="VerbatimChar"/>
+        </w:rPr>
+        <w:t xml:space="preserve">r=0.996</w:t>
       </w:r>
       <w:r>
         <w:t xml:space="preserve">, 95% CI</w:t>
@@ -1777,7 +1993,7 @@
         <w:rPr>
           <w:rStyle w:val="VerbatimChar"/>
         </w:rPr>
-        <w:t xml:space="preserve">[0.774, 0.943]</w:t>
+        <w:t xml:space="preserve">[0.994, 0.998]</w:t>
       </w:r>
       <w:r>
         <w:t xml:space="preserve">,</w:t>
@@ -1789,7 +2005,7 @@
         <w:rPr>
           <w:rStyle w:val="VerbatimChar"/>
         </w:rPr>
-        <w:t xml:space="preserve">p=2.4e-08</w:t>
+        <w:t xml:space="preserve">p&lt;1e-9</w:t>
       </w:r>
     </w:p>
     <w:p>
@@ -1797,17 +2013,32 @@
         <w:pStyle w:val="FirstParagraph"/>
       </w:pPr>
       <w:r>
-        <w:t xml:space="preserve">This preserved the mechanism finding while changing its interpretation: action-outcome loops increased operational agency, whereas workspace alone did not. The original high scores in no-action-loop thalamus systems were therefore not evidence for agency; they were evidence that information gating had been misclassified as agency.</w:t>
-      </w:r>
-    </w:p>
-    <w:bookmarkEnd w:id="32"/>
-    <w:bookmarkStart w:id="33" w:name="self-model-decomposition"/>
+        <w:t xml:space="preserve">Boundary self, identity-temporal self, action ownership, and body ownership are operationally separable. Only the first three refined self-related constructs above were upgraded into strong claims. Body ownership is not reported as a validated row because the available proxy-test pairing did not meet the</w:t>
+      </w:r>
+      <w:r>
+        <w:t xml:space="preserve"> </w:t>
+      </w:r>
+      <w:r>
+        <w:rPr>
+          <w:rStyle w:val="VerbatimChar"/>
+        </w:rPr>
+        <w:t xml:space="preserve">r &gt;= 0.7</w:t>
+      </w:r>
+      <w:r>
+        <w:t xml:space="preserve"> </w:t>
+      </w:r>
+      <w:r>
+        <w:t xml:space="preserve">criterion in the frozen Paper 1 analysis; stronger multisensory integration probes are left for future work.</w:t>
+      </w:r>
+    </w:p>
+    <w:bookmarkEnd w:id="33"/>
+    <w:bookmarkStart w:id="37" w:name="distributed-self-probes"/>
     <w:p>
       <w:pPr>
         <w:pStyle w:val="Heading2"/>
       </w:pPr>
       <w:r>
-        <w:t xml:space="preserve">3.3 Self-Model Decomposition</w:t>
+        <w:t xml:space="preserve">3.4 Distributed Self Probes</w:t>
       </w:r>
     </w:p>
     <w:p>
@@ -1815,7 +2046,7 @@
         <w:pStyle w:val="FirstParagraph"/>
       </w:pPr>
       <w:r>
-        <w:t xml:space="preserve">The initial self-model proxy mixed multiple operational constructs. Boundary/core self validated strongly:</w:t>
+        <w:t xml:space="preserve">Generic distributed self tests initially had poor dynamic range. We therefore added architecture-specific probes:</w:t>
       </w:r>
     </w:p>
     <w:p>
@@ -1827,40 +2058,31 @@
         </w:numPr>
       </w:pPr>
       <w:r>
-        <w:t xml:space="preserve">boundary self:</w:t>
-      </w:r>
-      <w:r>
-        <w:t xml:space="preserve"> </w:t>
-      </w:r>
-      <w:r>
-        <w:rPr>
-          <w:rStyle w:val="VerbatimChar"/>
-        </w:rPr>
-        <w:t xml:space="preserve">r=0.940</w:t>
-      </w:r>
-      <w:r>
-        <w:t xml:space="preserve">, 95% CI</w:t>
-      </w:r>
-      <w:r>
-        <w:t xml:space="preserve"> </w:t>
-      </w:r>
-      <w:r>
-        <w:rPr>
-          <w:rStyle w:val="VerbatimChar"/>
-        </w:rPr>
-        <w:t xml:space="preserve">[0.847, 0.994]</w:t>
-      </w:r>
-      <w:r>
-        <w:t xml:space="preserve">,</w:t>
-      </w:r>
-      <w:r>
-        <w:t xml:space="preserve"> </w:t>
-      </w:r>
-      <w:r>
-        <w:rPr>
-          <w:rStyle w:val="VerbatimChar"/>
-        </w:rPr>
-        <w:t xml:space="preserve">p&lt;1e-9</w:t>
+        <w:t xml:space="preserve">meta-monitor lesion</w:t>
+      </w:r>
+    </w:p>
+    <w:p>
+      <w:pPr>
+        <w:pStyle w:val="Compact"/>
+        <w:numPr>
+          <w:ilvl w:val="0"/>
+          <w:numId w:val="1012"/>
+        </w:numPr>
+      </w:pPr>
+      <w:r>
+        <w:t xml:space="preserve">hidden-agent perturbation</w:t>
+      </w:r>
+    </w:p>
+    <w:p>
+      <w:pPr>
+        <w:pStyle w:val="Compact"/>
+        <w:numPr>
+          <w:ilvl w:val="0"/>
+          <w:numId w:val="1012"/>
+        </w:numPr>
+      </w:pPr>
+      <w:r>
+        <w:t xml:space="preserve">body-schema update</w:t>
       </w:r>
     </w:p>
     <w:p>
@@ -1868,7 +2090,7 @@
         <w:pStyle w:val="FirstParagraph"/>
       </w:pPr>
       <w:r>
-        <w:t xml:space="preserve">Temporal self required further splitting. Generic trajectory consistency did not align with refined temporal tests. The validated temporal component was identity persistence:</w:t>
+        <w:t xml:space="preserve">With these probes, distributed body-schema/meta-monitor self validated strongly:</w:t>
       </w:r>
     </w:p>
     <w:p>
@@ -1880,16 +2102,16 @@
         </w:numPr>
       </w:pPr>
       <w:r>
-        <w:t xml:space="preserve">identity marker persistence vs delayed identity recognition:</w:t>
-      </w:r>
-      <w:r>
-        <w:t xml:space="preserve"> </w:t>
-      </w:r>
-      <w:r>
-        <w:rPr>
-          <w:rStyle w:val="VerbatimChar"/>
-        </w:rPr>
-        <w:t xml:space="preserve">r=0.850</w:t>
+        <w:t xml:space="preserve">distributed body-schema self:</w:t>
+      </w:r>
+      <w:r>
+        <w:t xml:space="preserve"> </w:t>
+      </w:r>
+      <w:r>
+        <w:rPr>
+          <w:rStyle w:val="VerbatimChar"/>
+        </w:rPr>
+        <w:t xml:space="preserve">r=0.924</w:t>
       </w:r>
       <w:r>
         <w:t xml:space="preserve">, 95% CI</w:t>
@@ -1901,7 +2123,7 @@
         <w:rPr>
           <w:rStyle w:val="VerbatimChar"/>
         </w:rPr>
-        <w:t xml:space="preserve">[0.755, 0.912]</w:t>
+        <w:t xml:space="preserve">[0.881, 0.956]</w:t>
       </w:r>
       <w:r>
         <w:t xml:space="preserve">,</w:t>
@@ -1921,7 +2143,7 @@
         <w:pStyle w:val="FirstParagraph"/>
       </w:pPr>
       <w:r>
-        <w:t xml:space="preserve">Ownership also required splitting. Body ownership remained exploratory, but action ownership validated strongly:</w:t>
+        <w:t xml:space="preserve">To rule out the explanation that hard probes merely detected a binary meta-monitor switch, we introduced graded meta-monitor controls. Hard-probe scores varied continuously with meta-monitor strength:</w:t>
       </w:r>
     </w:p>
     <w:p>
@@ -1933,16 +2155,16 @@
         </w:numPr>
       </w:pPr>
       <w:r>
-        <w:t xml:space="preserve">action ownership:</w:t>
-      </w:r>
-      <w:r>
-        <w:t xml:space="preserve"> </w:t>
-      </w:r>
-      <w:r>
-        <w:rPr>
-          <w:rStyle w:val="VerbatimChar"/>
-        </w:rPr>
-        <w:t xml:space="preserve">r=0.996</w:t>
+        <w:t xml:space="preserve">meta-monitor strength vs hard probes:</w:t>
+      </w:r>
+      <w:r>
+        <w:t xml:space="preserve"> </w:t>
+      </w:r>
+      <w:r>
+        <w:rPr>
+          <w:rStyle w:val="VerbatimChar"/>
+        </w:rPr>
+        <w:t xml:space="preserve">r=0.887</w:t>
       </w:r>
       <w:r>
         <w:t xml:space="preserve">, 95% CI</w:t>
@@ -1954,7 +2176,7 @@
         <w:rPr>
           <w:rStyle w:val="VerbatimChar"/>
         </w:rPr>
-        <w:t xml:space="preserve">[0.994, 0.998]</w:t>
+        <w:t xml:space="preserve">[0.846, 0.945]</w:t>
       </w:r>
       <w:r>
         <w:t xml:space="preserve">,</w:t>
@@ -1966,7 +2188,7 @@
         <w:rPr>
           <w:rStyle w:val="VerbatimChar"/>
         </w:rPr>
-        <w:t xml:space="preserve">p&lt;1e-9</w:t>
+        <w:t xml:space="preserve">p=7.9e-09</w:t>
       </w:r>
     </w:p>
     <w:p>
@@ -1974,25 +2196,7 @@
         <w:pStyle w:val="FirstParagraph"/>
       </w:pPr>
       <w:r>
-        <w:t xml:space="preserve">Boundary self, identity-temporal self, action ownership, and body ownership are operationally separable. Only the first three refined self-related constructs above were upgraded into strong claims. Body ownership remained exploratory because the available proxy and independent test did not yet converge.</w:t>
-      </w:r>
-    </w:p>
-    <w:bookmarkEnd w:id="33"/>
-    <w:bookmarkStart w:id="37" w:name="distributed-self-probes"/>
-    <w:p>
-      <w:pPr>
-        <w:pStyle w:val="Heading2"/>
-      </w:pPr>
-      <w:r>
-        <w:t xml:space="preserve">3.4 Distributed Self Probes</w:t>
-      </w:r>
-    </w:p>
-    <w:p>
-      <w:pPr>
-        <w:pStyle w:val="FirstParagraph"/>
-      </w:pPr>
-      <w:r>
-        <w:t xml:space="preserve">Generic distributed self tests initially had poor dynamic range. We therefore added architecture-specific probes:</w:t>
+        <w:t xml:space="preserve">Meta-monitor noise strongly degraded hard-probe scores:</w:t>
       </w:r>
     </w:p>
     <w:p>
@@ -2004,31 +2208,40 @@
         </w:numPr>
       </w:pPr>
       <w:r>
-        <w:t xml:space="preserve">meta-monitor lesion</w:t>
-      </w:r>
-    </w:p>
-    <w:p>
-      <w:pPr>
-        <w:pStyle w:val="Compact"/>
-        <w:numPr>
-          <w:ilvl w:val="0"/>
-          <w:numId w:val="1015"/>
-        </w:numPr>
-      </w:pPr>
-      <w:r>
-        <w:t xml:space="preserve">hidden-agent perturbation</w:t>
-      </w:r>
-    </w:p>
-    <w:p>
-      <w:pPr>
-        <w:pStyle w:val="Compact"/>
-        <w:numPr>
-          <w:ilvl w:val="0"/>
-          <w:numId w:val="1015"/>
-        </w:numPr>
-      </w:pPr>
-      <w:r>
-        <w:t xml:space="preserve">body-schema update</w:t>
+        <w:t xml:space="preserve">meta-monitor noise vs hard probes:</w:t>
+      </w:r>
+      <w:r>
+        <w:t xml:space="preserve"> </w:t>
+      </w:r>
+      <w:r>
+        <w:rPr>
+          <w:rStyle w:val="VerbatimChar"/>
+        </w:rPr>
+        <w:t xml:space="preserve">r=-0.974</w:t>
+      </w:r>
+      <w:r>
+        <w:t xml:space="preserve">, 95% CI</w:t>
+      </w:r>
+      <w:r>
+        <w:t xml:space="preserve"> </w:t>
+      </w:r>
+      <w:r>
+        <w:rPr>
+          <w:rStyle w:val="VerbatimChar"/>
+        </w:rPr>
+        <w:t xml:space="preserve">[-0.992, -0.952]</w:t>
+      </w:r>
+      <w:r>
+        <w:t xml:space="preserve">,</w:t>
+      </w:r>
+      <w:r>
+        <w:t xml:space="preserve"> </w:t>
+      </w:r>
+      <w:r>
+        <w:rPr>
+          <w:rStyle w:val="VerbatimChar"/>
+        </w:rPr>
+        <w:t xml:space="preserve">p=9.0e-08</w:t>
       </w:r>
     </w:p>
     <w:p>
@@ -2036,166 +2249,7 @@
         <w:pStyle w:val="FirstParagraph"/>
       </w:pPr>
       <w:r>
-        <w:t xml:space="preserve">With these probes, distributed body-schema/meta-monitor self validated strongly:</w:t>
-      </w:r>
-    </w:p>
-    <w:p>
-      <w:pPr>
-        <w:pStyle w:val="Compact"/>
-        <w:numPr>
-          <w:ilvl w:val="0"/>
-          <w:numId w:val="1016"/>
-        </w:numPr>
-      </w:pPr>
-      <w:r>
-        <w:t xml:space="preserve">distributed body-schema self:</w:t>
-      </w:r>
-      <w:r>
-        <w:t xml:space="preserve"> </w:t>
-      </w:r>
-      <w:r>
-        <w:rPr>
-          <w:rStyle w:val="VerbatimChar"/>
-        </w:rPr>
-        <w:t xml:space="preserve">r=0.924</w:t>
-      </w:r>
-      <w:r>
-        <w:t xml:space="preserve">, 95% CI</w:t>
-      </w:r>
-      <w:r>
-        <w:t xml:space="preserve"> </w:t>
-      </w:r>
-      <w:r>
-        <w:rPr>
-          <w:rStyle w:val="VerbatimChar"/>
-        </w:rPr>
-        <w:t xml:space="preserve">[0.881, 0.956]</w:t>
-      </w:r>
-      <w:r>
-        <w:t xml:space="preserve">,</w:t>
-      </w:r>
-      <w:r>
-        <w:t xml:space="preserve"> </w:t>
-      </w:r>
-      <w:r>
-        <w:rPr>
-          <w:rStyle w:val="VerbatimChar"/>
-        </w:rPr>
-        <w:t xml:space="preserve">p&lt;1e-9</w:t>
-      </w:r>
-    </w:p>
-    <w:p>
-      <w:pPr>
-        <w:pStyle w:val="FirstParagraph"/>
-      </w:pPr>
-      <w:r>
-        <w:t xml:space="preserve">To rule out the explanation that hard probes merely detected a binary meta-monitor switch, we introduced graded meta-monitor controls. Hard-probe scores varied continuously with meta-monitor strength:</w:t>
-      </w:r>
-    </w:p>
-    <w:p>
-      <w:pPr>
-        <w:pStyle w:val="Compact"/>
-        <w:numPr>
-          <w:ilvl w:val="0"/>
-          <w:numId w:val="1017"/>
-        </w:numPr>
-      </w:pPr>
-      <w:r>
-        <w:t xml:space="preserve">meta-monitor strength vs hard probes:</w:t>
-      </w:r>
-      <w:r>
-        <w:t xml:space="preserve"> </w:t>
-      </w:r>
-      <w:r>
-        <w:rPr>
-          <w:rStyle w:val="VerbatimChar"/>
-        </w:rPr>
-        <w:t xml:space="preserve">r=0.887</w:t>
-      </w:r>
-      <w:r>
-        <w:t xml:space="preserve">, 95% CI</w:t>
-      </w:r>
-      <w:r>
-        <w:t xml:space="preserve"> </w:t>
-      </w:r>
-      <w:r>
-        <w:rPr>
-          <w:rStyle w:val="VerbatimChar"/>
-        </w:rPr>
-        <w:t xml:space="preserve">[0.846, 0.945]</w:t>
-      </w:r>
-      <w:r>
-        <w:t xml:space="preserve">,</w:t>
-      </w:r>
-      <w:r>
-        <w:t xml:space="preserve"> </w:t>
-      </w:r>
-      <w:r>
-        <w:rPr>
-          <w:rStyle w:val="VerbatimChar"/>
-        </w:rPr>
-        <w:t xml:space="preserve">p=7.9e-09</w:t>
-      </w:r>
-    </w:p>
-    <w:p>
-      <w:pPr>
-        <w:pStyle w:val="FirstParagraph"/>
-      </w:pPr>
-      <w:r>
-        <w:t xml:space="preserve">Meta-monitor noise strongly degraded hard-probe scores:</w:t>
-      </w:r>
-    </w:p>
-    <w:p>
-      <w:pPr>
-        <w:pStyle w:val="Compact"/>
-        <w:numPr>
-          <w:ilvl w:val="0"/>
-          <w:numId w:val="1018"/>
-        </w:numPr>
-      </w:pPr>
-      <w:r>
-        <w:t xml:space="preserve">meta-monitor noise vs hard probes:</w:t>
-      </w:r>
-      <w:r>
-        <w:t xml:space="preserve"> </w:t>
-      </w:r>
-      <w:r>
-        <w:rPr>
-          <w:rStyle w:val="VerbatimChar"/>
-        </w:rPr>
-        <w:t xml:space="preserve">r=-0.974</w:t>
-      </w:r>
-      <w:r>
-        <w:t xml:space="preserve">, 95% CI</w:t>
-      </w:r>
-      <w:r>
-        <w:t xml:space="preserve"> </w:t>
-      </w:r>
-      <w:r>
-        <w:rPr>
-          <w:rStyle w:val="VerbatimChar"/>
-        </w:rPr>
-        <w:t xml:space="preserve">[-0.992, -0.952]</w:t>
-      </w:r>
-      <w:r>
-        <w:t xml:space="preserve">,</w:t>
-      </w:r>
-      <w:r>
-        <w:t xml:space="preserve"> </w:t>
-      </w:r>
-      <w:r>
-        <w:rPr>
-          <w:rStyle w:val="VerbatimChar"/>
-        </w:rPr>
-        <w:t xml:space="preserve">p=9.0e-08</w:t>
-      </w:r>
-    </w:p>
-    <w:p>
-      <w:pPr>
-        <w:pStyle w:val="FirstParagraph"/>
-      </w:pPr>
-      <w:r>
-        <w:t xml:space="preserve">This supports the interpretation that hard probes track functional meta-monitor quality, not merely module presence (Figure 5).</w:t>
+        <w:t xml:space="preserve">This supports the interpretation that hard probes track functional meta-monitor quality, not merely module presence (Figure 3).</w:t>
       </w:r>
     </w:p>
     <w:p>
@@ -2207,7 +2261,7 @@
           <wp:inline>
             <wp:extent cx="5067300" cy="1945389"/>
             <wp:effectExtent b="0" l="0" r="0" t="0"/>
-            <wp:docPr descr="Figure 5. Distributed graded meta-monitor controls." title="" id="35" name="Picture"/>
+            <wp:docPr descr="Distributed graded meta-monitor controls." title="" id="35" name="Picture"/>
             <a:graphic>
               <a:graphicData uri="http://schemas.openxmlformats.org/drawingml/2006/picture">
                 <pic:pic>
@@ -2250,7 +2304,7 @@
         <w:pStyle w:val="ImageCaption"/>
       </w:pPr>
       <w:r>
-        <w:t xml:space="preserve">Figure 5. Distributed graded meta-monitor controls.</w:t>
+        <w:t xml:space="preserve">Distributed graded meta-monitor controls.</w:t>
       </w:r>
     </w:p>
     <w:bookmarkEnd w:id="37"/>
@@ -2283,70 +2337,469 @@
         <w:t xml:space="preserve">Table 1. Validated operational constructs and associated mechanisms.</w:t>
       </w:r>
     </w:p>
-    <w:p>
-      <w:pPr>
-        <w:pStyle w:val="BodyText"/>
-      </w:pPr>
-      <w:r>
-        <w:t xml:space="preserve">Construct | n | Proxy-test r (95% CI) | p | Status | Mechanism |</w:t>
-      </w:r>
-    </w:p>
-    <w:p>
-      <w:pPr>
-        <w:pStyle w:val="BodyText"/>
-      </w:pPr>
-      <w:r>
-        <w:t xml:space="preserve">|–-|–-:|–-:|–-:|–-|–-|</w:t>
-      </w:r>
-      <w:r>
-        <w:t xml:space="preserve"> </w:t>
-      </w:r>
-      <w:r>
-        <w:t xml:space="preserve">| Action agency | 24 | 0.874 [0.774, 0.943] | 2.4e-08 | validated | action-outcome loop |</w:t>
-      </w:r>
-      <w:r>
-        <w:t xml:space="preserve"> </w:t>
-      </w:r>
-      <w:r>
-        <w:t xml:space="preserve">| Boundary self | 24 | 0.940 [0.847, 0.994] | &lt;1e-9 | validated | workspace |</w:t>
-      </w:r>
-      <w:r>
-        <w:t xml:space="preserve"> </w:t>
-      </w:r>
-      <w:r>
-        <w:t xml:space="preserve">| Identity-temporal self | 48 | 0.850 [0.755, 0.912] | &lt;1e-9 | validated | workspace |</w:t>
-      </w:r>
-      <w:r>
-        <w:t xml:space="preserve"> </w:t>
-      </w:r>
-      <w:r>
-        <w:t xml:space="preserve">| Action ownership | 48 | 0.996 [0.994, 0.998] | &lt;1e-9 | validated | action-outcome loop |</w:t>
-      </w:r>
-      <w:r>
-        <w:t xml:space="preserve"> </w:t>
-      </w:r>
-      <w:r>
-        <w:t xml:space="preserve">| Distributed body-schema self | 52 | 0.924 [0.881, 0.956] | &lt;1e-9 | validated | meta-monitor |</w:t>
-      </w:r>
-    </w:p>
-    <w:p>
-      <w:pPr>
-        <w:pStyle w:val="BodyText"/>
-      </w:pPr>
-      <w:r>
-        <w:t xml:space="preserve">These correlations are visualized in Figure 3.</w:t>
-      </w:r>
-    </w:p>
-    <w:p>
-      <w:pPr>
-        <w:pStyle w:val="BodyText"/>
+    <w:tbl>
+      <w:tblPr>
+        <w:tblStyle w:val="Table"/>
+        <w:tblW w:type="pct" w:w="5000"/>
+        <w:tblLayout w:type="fixed"/>
+        <w:tblLook w:firstRow="1" w:lastRow="0" w:firstColumn="0" w:lastColumn="0" w:noHBand="0" w:noVBand="0" w:val="0020"/>
+      </w:tblPr>
+      <w:tblGrid>
+        <w:gridCol w:w="1131"/>
+        <w:gridCol w:w="1508"/>
+        <w:gridCol w:w="1508"/>
+        <w:gridCol w:w="1508"/>
+        <w:gridCol w:w="1131"/>
+        <w:gridCol w:w="1131"/>
+      </w:tblGrid>
+      <w:tr>
+        <w:trPr>
+          <w:tblHeader w:val="on"/>
+        </w:trPr>
+        <w:tc>
+          <w:tcPr/>
+          <w:p>
+            <w:pPr>
+              <w:pStyle w:val="Compact"/>
+            </w:pPr>
+            <w:r>
+              <w:t xml:space="preserve">Construct</w:t>
+            </w:r>
+          </w:p>
+        </w:tc>
+        <w:tc>
+          <w:tcPr/>
+          <w:p>
+            <w:pPr>
+              <w:pStyle w:val="Compact"/>
+              <w:jc w:val="right"/>
+            </w:pPr>
+            <w:r>
+              <w:t xml:space="preserve">n</w:t>
+            </w:r>
+          </w:p>
+        </w:tc>
+        <w:tc>
+          <w:tcPr/>
+          <w:p>
+            <w:pPr>
+              <w:pStyle w:val="Compact"/>
+              <w:jc w:val="right"/>
+            </w:pPr>
+            <w:r>
+              <w:t xml:space="preserve">Proxy-test r (95% CI)</w:t>
+            </w:r>
+          </w:p>
+        </w:tc>
+        <w:tc>
+          <w:tcPr/>
+          <w:p>
+            <w:pPr>
+              <w:pStyle w:val="Compact"/>
+              <w:jc w:val="right"/>
+            </w:pPr>
+            <w:r>
+              <w:t xml:space="preserve">p</w:t>
+            </w:r>
+          </w:p>
+        </w:tc>
+        <w:tc>
+          <w:tcPr/>
+          <w:p>
+            <w:pPr>
+              <w:pStyle w:val="Compact"/>
+            </w:pPr>
+            <w:r>
+              <w:t xml:space="preserve">Status</w:t>
+            </w:r>
+          </w:p>
+        </w:tc>
+        <w:tc>
+          <w:tcPr/>
+          <w:p>
+            <w:pPr>
+              <w:pStyle w:val="Compact"/>
+            </w:pPr>
+            <w:r>
+              <w:t xml:space="preserve">Mechanism</w:t>
+            </w:r>
+          </w:p>
+        </w:tc>
+      </w:tr>
+      <w:tr>
+        <w:tc>
+          <w:tcPr/>
+          <w:p>
+            <w:pPr>
+              <w:pStyle w:val="Compact"/>
+            </w:pPr>
+            <w:r>
+              <w:t xml:space="preserve">Action agency</w:t>
+            </w:r>
+          </w:p>
+        </w:tc>
+        <w:tc>
+          <w:tcPr/>
+          <w:p>
+            <w:pPr>
+              <w:pStyle w:val="Compact"/>
+              <w:jc w:val="right"/>
+            </w:pPr>
+            <w:r>
+              <w:t xml:space="preserve">24</w:t>
+            </w:r>
+          </w:p>
+        </w:tc>
+        <w:tc>
+          <w:tcPr/>
+          <w:p>
+            <w:pPr>
+              <w:pStyle w:val="Compact"/>
+              <w:jc w:val="right"/>
+            </w:pPr>
+            <w:r>
+              <w:t xml:space="preserve">0.874 [0.774, 0.943]</w:t>
+            </w:r>
+          </w:p>
+        </w:tc>
+        <w:tc>
+          <w:tcPr/>
+          <w:p>
+            <w:pPr>
+              <w:pStyle w:val="Compact"/>
+              <w:jc w:val="right"/>
+            </w:pPr>
+            <w:r>
+              <w:t xml:space="preserve">2.4e-08</w:t>
+            </w:r>
+          </w:p>
+        </w:tc>
+        <w:tc>
+          <w:tcPr/>
+          <w:p>
+            <w:pPr>
+              <w:pStyle w:val="Compact"/>
+            </w:pPr>
+            <w:r>
+              <w:t xml:space="preserve">validated</w:t>
+            </w:r>
+          </w:p>
+        </w:tc>
+        <w:tc>
+          <w:tcPr/>
+          <w:p>
+            <w:pPr>
+              <w:pStyle w:val="Compact"/>
+            </w:pPr>
+            <w:r>
+              <w:t xml:space="preserve">action-outcome loop</w:t>
+            </w:r>
+          </w:p>
+        </w:tc>
+      </w:tr>
+      <w:tr>
+        <w:tc>
+          <w:tcPr/>
+          <w:p>
+            <w:pPr>
+              <w:pStyle w:val="Compact"/>
+            </w:pPr>
+            <w:r>
+              <w:t xml:space="preserve">Boundary self</w:t>
+            </w:r>
+          </w:p>
+        </w:tc>
+        <w:tc>
+          <w:tcPr/>
+          <w:p>
+            <w:pPr>
+              <w:pStyle w:val="Compact"/>
+              <w:jc w:val="right"/>
+            </w:pPr>
+            <w:r>
+              <w:t xml:space="preserve">24</w:t>
+            </w:r>
+          </w:p>
+        </w:tc>
+        <w:tc>
+          <w:tcPr/>
+          <w:p>
+            <w:pPr>
+              <w:pStyle w:val="Compact"/>
+              <w:jc w:val="right"/>
+            </w:pPr>
+            <w:r>
+              <w:t xml:space="preserve">0.940 [0.847, 0.994]</w:t>
+            </w:r>
+          </w:p>
+        </w:tc>
+        <w:tc>
+          <w:tcPr/>
+          <w:p>
+            <w:pPr>
+              <w:pStyle w:val="Compact"/>
+              <w:jc w:val="right"/>
+            </w:pPr>
+            <w:r>
+              <w:t xml:space="preserve">&lt;1e-9</w:t>
+            </w:r>
+          </w:p>
+        </w:tc>
+        <w:tc>
+          <w:tcPr/>
+          <w:p>
+            <w:pPr>
+              <w:pStyle w:val="Compact"/>
+            </w:pPr>
+            <w:r>
+              <w:t xml:space="preserve">validated</w:t>
+            </w:r>
+          </w:p>
+        </w:tc>
+        <w:tc>
+          <w:tcPr/>
+          <w:p>
+            <w:pPr>
+              <w:pStyle w:val="Compact"/>
+            </w:pPr>
+            <w:r>
+              <w:t xml:space="preserve">workspace</w:t>
+            </w:r>
+          </w:p>
+        </w:tc>
+      </w:tr>
+      <w:tr>
+        <w:tc>
+          <w:tcPr/>
+          <w:p>
+            <w:pPr>
+              <w:pStyle w:val="Compact"/>
+            </w:pPr>
+            <w:r>
+              <w:t xml:space="preserve">Identity-temporal self</w:t>
+            </w:r>
+          </w:p>
+        </w:tc>
+        <w:tc>
+          <w:tcPr/>
+          <w:p>
+            <w:pPr>
+              <w:pStyle w:val="Compact"/>
+              <w:jc w:val="right"/>
+            </w:pPr>
+            <w:r>
+              <w:t xml:space="preserve">48</w:t>
+            </w:r>
+          </w:p>
+        </w:tc>
+        <w:tc>
+          <w:tcPr/>
+          <w:p>
+            <w:pPr>
+              <w:pStyle w:val="Compact"/>
+              <w:jc w:val="right"/>
+            </w:pPr>
+            <w:r>
+              <w:t xml:space="preserve">0.850 [0.755, 0.912]</w:t>
+            </w:r>
+          </w:p>
+        </w:tc>
+        <w:tc>
+          <w:tcPr/>
+          <w:p>
+            <w:pPr>
+              <w:pStyle w:val="Compact"/>
+              <w:jc w:val="right"/>
+            </w:pPr>
+            <w:r>
+              <w:t xml:space="preserve">&lt;1e-9</w:t>
+            </w:r>
+          </w:p>
+        </w:tc>
+        <w:tc>
+          <w:tcPr/>
+          <w:p>
+            <w:pPr>
+              <w:pStyle w:val="Compact"/>
+            </w:pPr>
+            <w:r>
+              <w:t xml:space="preserve">validated</w:t>
+            </w:r>
+          </w:p>
+        </w:tc>
+        <w:tc>
+          <w:tcPr/>
+          <w:p>
+            <w:pPr>
+              <w:pStyle w:val="Compact"/>
+            </w:pPr>
+            <w:r>
+              <w:t xml:space="preserve">workspace</w:t>
+            </w:r>
+          </w:p>
+        </w:tc>
+      </w:tr>
+      <w:tr>
+        <w:tc>
+          <w:tcPr/>
+          <w:p>
+            <w:pPr>
+              <w:pStyle w:val="Compact"/>
+            </w:pPr>
+            <w:r>
+              <w:t xml:space="preserve">Action ownership</w:t>
+            </w:r>
+          </w:p>
+        </w:tc>
+        <w:tc>
+          <w:tcPr/>
+          <w:p>
+            <w:pPr>
+              <w:pStyle w:val="Compact"/>
+              <w:jc w:val="right"/>
+            </w:pPr>
+            <w:r>
+              <w:t xml:space="preserve">48</w:t>
+            </w:r>
+          </w:p>
+        </w:tc>
+        <w:tc>
+          <w:tcPr/>
+          <w:p>
+            <w:pPr>
+              <w:pStyle w:val="Compact"/>
+              <w:jc w:val="right"/>
+            </w:pPr>
+            <w:r>
+              <w:t xml:space="preserve">0.996 [0.994, 0.998]</w:t>
+            </w:r>
+          </w:p>
+        </w:tc>
+        <w:tc>
+          <w:tcPr/>
+          <w:p>
+            <w:pPr>
+              <w:pStyle w:val="Compact"/>
+              <w:jc w:val="right"/>
+            </w:pPr>
+            <w:r>
+              <w:t xml:space="preserve">&lt;1e-9</w:t>
+            </w:r>
+          </w:p>
+        </w:tc>
+        <w:tc>
+          <w:tcPr/>
+          <w:p>
+            <w:pPr>
+              <w:pStyle w:val="Compact"/>
+            </w:pPr>
+            <w:r>
+              <w:t xml:space="preserve">validated</w:t>
+            </w:r>
+          </w:p>
+        </w:tc>
+        <w:tc>
+          <w:tcPr/>
+          <w:p>
+            <w:pPr>
+              <w:pStyle w:val="Compact"/>
+            </w:pPr>
+            <w:r>
+              <w:t xml:space="preserve">action-outcome loop</w:t>
+            </w:r>
+          </w:p>
+        </w:tc>
+      </w:tr>
+      <w:tr>
+        <w:tc>
+          <w:tcPr/>
+          <w:p>
+            <w:pPr>
+              <w:pStyle w:val="Compact"/>
+            </w:pPr>
+            <w:r>
+              <w:t xml:space="preserve">Distributed body-schema self</w:t>
+            </w:r>
+          </w:p>
+        </w:tc>
+        <w:tc>
+          <w:tcPr/>
+          <w:p>
+            <w:pPr>
+              <w:pStyle w:val="Compact"/>
+              <w:jc w:val="right"/>
+            </w:pPr>
+            <w:r>
+              <w:t xml:space="preserve">52</w:t>
+            </w:r>
+          </w:p>
+        </w:tc>
+        <w:tc>
+          <w:tcPr/>
+          <w:p>
+            <w:pPr>
+              <w:pStyle w:val="Compact"/>
+              <w:jc w:val="right"/>
+            </w:pPr>
+            <w:r>
+              <w:t xml:space="preserve">0.924 [0.881, 0.956]</w:t>
+            </w:r>
+          </w:p>
+        </w:tc>
+        <w:tc>
+          <w:tcPr/>
+          <w:p>
+            <w:pPr>
+              <w:pStyle w:val="Compact"/>
+              <w:jc w:val="right"/>
+            </w:pPr>
+            <w:r>
+              <w:t xml:space="preserve">&lt;1e-9</w:t>
+            </w:r>
+          </w:p>
+        </w:tc>
+        <w:tc>
+          <w:tcPr/>
+          <w:p>
+            <w:pPr>
+              <w:pStyle w:val="Compact"/>
+            </w:pPr>
+            <w:r>
+              <w:t xml:space="preserve">validated</w:t>
+            </w:r>
+          </w:p>
+        </w:tc>
+        <w:tc>
+          <w:tcPr/>
+          <w:p>
+            <w:pPr>
+              <w:pStyle w:val="Compact"/>
+            </w:pPr>
+            <w:r>
+              <w:t xml:space="preserve">meta-monitor</w:t>
+            </w:r>
+          </w:p>
+        </w:tc>
+      </w:tr>
+    </w:tbl>
+    <w:p>
+      <w:pPr>
+        <w:pStyle w:val="BodyText"/>
+      </w:pPr>
+      <w:r>
+        <w:t xml:space="preserve">These correlations are visualized in Figure 4.</w:t>
+      </w:r>
+    </w:p>
+    <w:p>
+      <w:pPr>
+        <w:pStyle w:val="CaptionedFigure"/>
       </w:pPr>
       <w:r>
         <w:drawing>
           <wp:inline>
             <wp:extent cx="5067300" cy="2977244"/>
             <wp:effectExtent b="0" l="0" r="0" t="0"/>
-            <wp:docPr descr="Figure 3. Five validated operational constructs." title="" id="39" name="Picture"/>
+            <wp:docPr descr="Five validated operational constructs." title="" id="39" name="Picture"/>
             <a:graphic>
               <a:graphicData uri="http://schemas.openxmlformats.org/drawingml/2006/picture">
                 <pic:pic>
@@ -2383,9 +2836,19 @@
           </wp:inline>
         </w:drawing>
       </w:r>
-      <w:r>
-        <w:t xml:space="preserve"> </w:t>
-      </w:r>
+    </w:p>
+    <w:p>
+      <w:pPr>
+        <w:pStyle w:val="ImageCaption"/>
+      </w:pPr>
+      <w:r>
+        <w:t xml:space="preserve">Five validated operational constructs.</w:t>
+      </w:r>
+    </w:p>
+    <w:p>
+      <w:pPr>
+        <w:pStyle w:val="BodyText"/>
+      </w:pPr>
       <w:r>
         <w:t xml:space="preserve">Sample sizes differ because the first two constructs use the thalamus factorial validation set, identity-temporal self and action ownership include the refined extension probes, and distributed body-schema self includes architecture-specific hard probes plus graded meta-monitor controls. For the distributed architecture, graded controls served as the analogue of the factorial mechanism check because the architecture was not organized around the same workspace-by-action-loop design.</w:t>
       </w:r>
@@ -2395,7 +2858,45 @@
         <w:pStyle w:val="BodyText"/>
       </w:pPr>
       <w:r>
-        <w:t xml:space="preserve">Extended 16-seed robustness analyses are reported in Supplementary Section S1.</w:t>
+        <w:t xml:space="preserve">Extended 16-seed robustness analyses are reported in Supplementary Section S1. In that extension, all five constructs remained above the validation threshold, but estimates were generally lower; action agency decreased from</w:t>
+      </w:r>
+      <w:r>
+        <w:t xml:space="preserve"> </w:t>
+      </w:r>
+      <w:r>
+        <w:rPr>
+          <w:rStyle w:val="VerbatimChar"/>
+        </w:rPr>
+        <w:t xml:space="preserve">r=0.874</w:t>
+      </w:r>
+      <w:r>
+        <w:t xml:space="preserve"> </w:t>
+      </w:r>
+      <w:r>
+        <w:t xml:space="preserve">in the frozen primary table to</w:t>
+      </w:r>
+      <w:r>
+        <w:t xml:space="preserve"> </w:t>
+      </w:r>
+      <w:r>
+        <w:rPr>
+          <w:rStyle w:val="VerbatimChar"/>
+        </w:rPr>
+        <w:t xml:space="preserve">r=0.727</w:t>
+      </w:r>
+      <w:r>
+        <w:t xml:space="preserve"> </w:t>
+      </w:r>
+      <w:r>
+        <w:t xml:space="preserve">in the 16-seed pooled run. The primary values should therefore be read as frozen estimates from the prerelease analysis pass, not as final population estimates.</w:t>
+      </w:r>
+    </w:p>
+    <w:p>
+      <w:pPr>
+        <w:pStyle w:val="BodyText"/>
+      </w:pPr>
+      <w:r>
+        <w:t xml:space="preserve">The near-ceiling action-ownership convergence is interpreted with care in Section 4.5: under the low-noise primary conditions, proxy and independent tests share substantial task variance, so the magnitude should be read as a stable measurement coupling rather than as independent statistical strength.</w:t>
       </w:r>
     </w:p>
     <w:bookmarkEnd w:id="41"/>
@@ -2421,7 +2922,7 @@
         <w:pStyle w:val="Compact"/>
         <w:numPr>
           <w:ilvl w:val="0"/>
-          <w:numId w:val="1019"/>
+          <w:numId w:val="1016"/>
         </w:numPr>
       </w:pPr>
       <w:r>
@@ -2517,7 +3018,7 @@
         <w:pStyle w:val="Compact"/>
         <w:numPr>
           <w:ilvl w:val="0"/>
-          <w:numId w:val="1019"/>
+          <w:numId w:val="1016"/>
         </w:numPr>
       </w:pPr>
       <w:r>
@@ -2613,7 +3114,7 @@
         <w:pStyle w:val="Compact"/>
         <w:numPr>
           <w:ilvl w:val="0"/>
-          <w:numId w:val="1019"/>
+          <w:numId w:val="1016"/>
         </w:numPr>
       </w:pPr>
       <w:r>
@@ -2667,7 +3168,7 @@
         <w:pStyle w:val="FirstParagraph"/>
       </w:pPr>
       <w:r>
-        <w:t xml:space="preserve">This supports an operational triple dissociation among workspace, action-outcome, and meta-monitoring mechanisms (Figure 4).</w:t>
+        <w:t xml:space="preserve">This supports an operational triple dissociation among workspace, action-outcome, and meta-monitoring mechanisms (Figure 5).</w:t>
       </w:r>
     </w:p>
     <w:p>
@@ -2679,7 +3180,7 @@
           <wp:inline>
             <wp:extent cx="5067300" cy="3770396"/>
             <wp:effectExtent b="0" l="0" r="0" t="0"/>
-            <wp:docPr descr="Figure 4. Mechanistic triple dissociation." title="" id="43" name="Picture"/>
+            <wp:docPr descr="Mechanistic triple dissociation." title="" id="43" name="Picture"/>
             <a:graphic>
               <a:graphicData uri="http://schemas.openxmlformats.org/drawingml/2006/picture">
                 <pic:pic>
@@ -2722,17 +3223,17 @@
         <w:pStyle w:val="ImageCaption"/>
       </w:pPr>
       <w:r>
-        <w:t xml:space="preserve">Figure 4. Mechanistic triple dissociation.</w:t>
+        <w:t xml:space="preserve">Mechanistic triple dissociation.</w:t>
       </w:r>
     </w:p>
     <w:bookmarkEnd w:id="45"/>
-    <w:bookmarkStart w:id="49" w:name="transformer-follow-up"/>
+    <w:bookmarkStart w:id="49" w:name="minimal-attention-based-follow-up-1"/>
     <w:p>
       <w:pPr>
         <w:pStyle w:val="Heading2"/>
       </w:pPr>
       <w:r>
-        <w:t xml:space="preserve">3.7 Transformer Follow-Up</w:t>
+        <w:t xml:space="preserve">3.7 Minimal Attention-Based Follow-Up</w:t>
       </w:r>
     </w:p>
     <w:p>
@@ -2740,7 +3241,7 @@
         <w:pStyle w:val="FirstParagraph"/>
       </w:pPr>
       <w:r>
-        <w:t xml:space="preserve">The Transformer-inspired follow-up tested whether the mechanism pattern generalized to an attention-based substrate. The initial 2x2 run showed selective mechanism effects while also exposing architecture-specific measurement limits (Figure 6).</w:t>
+        <w:t xml:space="preserve">The minimal attention-based follow-up tested whether the mechanism pattern generalized to a Transformer-style but non-language-model substrate. The initial 2x2 run showed selective mechanism effects while also exposing architecture-specific measurement limits (Figure 6).</w:t>
       </w:r>
     </w:p>
     <w:p>
@@ -2752,7 +3253,7 @@
           <wp:inline>
             <wp:extent cx="5067300" cy="3650856"/>
             <wp:effectExtent b="0" l="0" r="0" t="0"/>
-            <wp:docPr descr="Figure 6. Transformer follow-up diagnostics." title="" id="47" name="Picture"/>
+            <wp:docPr descr="Minimal attention-based follow-up diagnostics." title="" id="47" name="Picture"/>
             <a:graphic>
               <a:graphicData uri="http://schemas.openxmlformats.org/drawingml/2006/picture">
                 <pic:pic>
@@ -2795,7 +3296,7 @@
         <w:pStyle w:val="ImageCaption"/>
       </w:pPr>
       <w:r>
-        <w:t xml:space="preserve">Figure 6. Transformer follow-up diagnostics.</w:t>
+        <w:t xml:space="preserve">Minimal attention-based follow-up diagnostics.</w:t>
       </w:r>
     </w:p>
     <w:p>
@@ -3042,28 +3543,51 @@
         <w:t xml:space="preserve">[0.999990, 0.999999]</w:t>
       </w:r>
       <w:r>
-        <w:t xml:space="preserve">). A difficulty diagnostic varied action-effect noise and action-loop learning rate. Under these diagnostics, convergence dropped:</w:t>
-      </w:r>
-    </w:p>
-    <w:p>
-      <w:pPr>
-        <w:pStyle w:val="Compact"/>
-        <w:numPr>
-          <w:ilvl w:val="0"/>
-          <w:numId w:val="1020"/>
-        </w:numPr>
-      </w:pPr>
-      <w:r>
-        <w:t xml:space="preserve">all diagnostic conditions, agency proxy vs independent agency:</w:t>
-      </w:r>
-      <w:r>
-        <w:t xml:space="preserve"> </w:t>
-      </w:r>
-      <w:r>
-        <w:rPr>
-          <w:rStyle w:val="VerbatimChar"/>
-        </w:rPr>
-        <w:t xml:space="preserve">n=104</w:t>
+        <w:t xml:space="preserve">). Difficulty diagnostics reduced these values when action-effect noise and action-loop learning rate were varied, with pooled convergence dropping to</w:t>
+      </w:r>
+      <w:r>
+        <w:t xml:space="preserve"> </w:t>
+      </w:r>
+      <w:r>
+        <w:rPr>
+          <w:rStyle w:val="VerbatimChar"/>
+        </w:rPr>
+        <w:t xml:space="preserve">r=0.795</w:t>
+      </w:r>
+      <w:r>
+        <w:t xml:space="preserve"> </w:t>
+      </w:r>
+      <w:r>
+        <w:t xml:space="preserve">for agency and</w:t>
+      </w:r>
+      <w:r>
+        <w:t xml:space="preserve"> </w:t>
+      </w:r>
+      <w:r>
+        <w:rPr>
+          <w:rStyle w:val="VerbatimChar"/>
+        </w:rPr>
+        <w:t xml:space="preserve">r=0.664</w:t>
+      </w:r>
+      <w:r>
+        <w:t xml:space="preserve"> </w:t>
+      </w:r>
+      <w:r>
+        <w:t xml:space="preserve">for ownership. This indicates that the near-ceiling correlations reflected shared variance from action-outcome prediction accuracy under low-noise conditions. The mechanism effect remains meaningful, but the low-noise validation statistic should not be interpreted as independent construct validation.</w:t>
+      </w:r>
+    </w:p>
+    <w:p>
+      <w:pPr>
+        <w:pStyle w:val="BodyText"/>
+      </w:pPr>
+      <w:r>
+        <w:t xml:space="preserve">Boundary self showed the opposite pattern. Workspace dose tracked the internal boundary proxy (</w:t>
+      </w:r>
+      <w:r>
+        <w:rPr>
+          <w:rStyle w:val="VerbatimChar"/>
+        </w:rPr>
+        <w:t xml:space="preserve">n=40</w:t>
       </w:r>
       <w:r>
         <w:t xml:space="preserve">,</w:t>
@@ -3075,7 +3599,7 @@
         <w:rPr>
           <w:rStyle w:val="VerbatimChar"/>
         </w:rPr>
-        <w:t xml:space="preserve">r=0.795</w:t>
+        <w:t xml:space="preserve">r=0.728</w:t>
       </w:r>
       <w:r>
         <w:t xml:space="preserve">, 95% CI</w:t>
@@ -3087,263 +3611,10 @@
         <w:rPr>
           <w:rStyle w:val="VerbatimChar"/>
         </w:rPr>
-        <w:t xml:space="preserve">[0.762, 0.836]</w:t>
-      </w:r>
-    </w:p>
-    <w:p>
-      <w:pPr>
-        <w:pStyle w:val="Compact"/>
-        <w:numPr>
-          <w:ilvl w:val="0"/>
-          <w:numId w:val="1020"/>
-        </w:numPr>
-      </w:pPr>
-      <w:r>
-        <w:t xml:space="preserve">all diagnostic conditions, ownership proxy vs independent ownership:</w:t>
-      </w:r>
-      <w:r>
-        <w:t xml:space="preserve"> </w:t>
-      </w:r>
-      <w:r>
-        <w:rPr>
-          <w:rStyle w:val="VerbatimChar"/>
-        </w:rPr>
-        <w:t xml:space="preserve">n=104</w:t>
-      </w:r>
-      <w:r>
-        <w:t xml:space="preserve">,</w:t>
-      </w:r>
-      <w:r>
-        <w:t xml:space="preserve"> </w:t>
-      </w:r>
-      <w:r>
-        <w:rPr>
-          <w:rStyle w:val="VerbatimChar"/>
-        </w:rPr>
-        <w:t xml:space="preserve">r=0.664</w:t>
-      </w:r>
-      <w:r>
-        <w:t xml:space="preserve">, 95% CI</w:t>
-      </w:r>
-      <w:r>
-        <w:t xml:space="preserve"> </w:t>
-      </w:r>
-      <w:r>
-        <w:rPr>
-          <w:rStyle w:val="VerbatimChar"/>
-        </w:rPr>
-        <w:t xml:space="preserve">[0.589, 0.739]</w:t>
-      </w:r>
-    </w:p>
-    <w:p>
-      <w:pPr>
-        <w:pStyle w:val="Compact"/>
-        <w:numPr>
-          <w:ilvl w:val="0"/>
-          <w:numId w:val="1020"/>
-        </w:numPr>
-      </w:pPr>
-      <w:r>
-        <w:t xml:space="preserve">noise sweep only, agency proxy vs independent agency:</w:t>
-      </w:r>
-      <w:r>
-        <w:t xml:space="preserve"> </w:t>
-      </w:r>
-      <w:r>
-        <w:rPr>
-          <w:rStyle w:val="VerbatimChar"/>
-        </w:rPr>
-        <w:t xml:space="preserve">n=48</w:t>
-      </w:r>
-      <w:r>
-        <w:t xml:space="preserve">,</w:t>
-      </w:r>
-      <w:r>
-        <w:t xml:space="preserve"> </w:t>
-      </w:r>
-      <w:r>
-        <w:rPr>
-          <w:rStyle w:val="VerbatimChar"/>
-        </w:rPr>
-        <w:t xml:space="preserve">r=0.991</w:t>
-      </w:r>
-      <w:r>
-        <w:t xml:space="preserve">, 95% CI</w:t>
-      </w:r>
-      <w:r>
-        <w:t xml:space="preserve"> </w:t>
-      </w:r>
-      <w:r>
-        <w:rPr>
-          <w:rStyle w:val="VerbatimChar"/>
-        </w:rPr>
-        <w:t xml:space="preserve">[0.986, 0.994]</w:t>
-      </w:r>
-    </w:p>
-    <w:p>
-      <w:pPr>
-        <w:pStyle w:val="Compact"/>
-        <w:numPr>
-          <w:ilvl w:val="0"/>
-          <w:numId w:val="1020"/>
-        </w:numPr>
-      </w:pPr>
-      <w:r>
-        <w:t xml:space="preserve">learning-rate sweep only, agency proxy vs independent agency:</w:t>
-      </w:r>
-      <w:r>
-        <w:t xml:space="preserve"> </w:t>
-      </w:r>
-      <w:r>
-        <w:rPr>
-          <w:rStyle w:val="VerbatimChar"/>
-        </w:rPr>
-        <w:t xml:space="preserve">n=40</w:t>
-      </w:r>
-      <w:r>
-        <w:t xml:space="preserve">,</w:t>
-      </w:r>
-      <w:r>
-        <w:t xml:space="preserve"> </w:t>
-      </w:r>
-      <w:r>
-        <w:rPr>
-          <w:rStyle w:val="VerbatimChar"/>
-        </w:rPr>
-        <w:t xml:space="preserve">r=0.266</w:t>
-      </w:r>
-      <w:r>
-        <w:t xml:space="preserve">, 95% CI</w:t>
-      </w:r>
-      <w:r>
-        <w:t xml:space="preserve"> </w:t>
-      </w:r>
-      <w:r>
-        <w:rPr>
-          <w:rStyle w:val="VerbatimChar"/>
-        </w:rPr>
-        <w:t xml:space="preserve">[0.030, 0.516]</w:t>
-      </w:r>
-    </w:p>
-    <w:p>
-      <w:pPr>
-        <w:pStyle w:val="Compact"/>
-        <w:numPr>
-          <w:ilvl w:val="0"/>
-          <w:numId w:val="1020"/>
-        </w:numPr>
-      </w:pPr>
-      <w:r>
-        <w:t xml:space="preserve">learning-rate sweep only, ownership proxy vs independent ownership:</w:t>
-      </w:r>
-      <w:r>
-        <w:t xml:space="preserve"> </w:t>
-      </w:r>
-      <w:r>
-        <w:rPr>
-          <w:rStyle w:val="VerbatimChar"/>
-        </w:rPr>
-        <w:t xml:space="preserve">n=40</w:t>
-      </w:r>
-      <w:r>
-        <w:t xml:space="preserve">,</w:t>
-      </w:r>
-      <w:r>
-        <w:t xml:space="preserve"> </w:t>
-      </w:r>
-      <w:r>
-        <w:rPr>
-          <w:rStyle w:val="VerbatimChar"/>
-        </w:rPr>
-        <w:t xml:space="preserve">r=-0.122</w:t>
-      </w:r>
-      <w:r>
-        <w:t xml:space="preserve">, 95% CI</w:t>
-      </w:r>
-      <w:r>
-        <w:t xml:space="preserve"> </w:t>
-      </w:r>
-      <w:r>
-        <w:rPr>
-          <w:rStyle w:val="VerbatimChar"/>
-        </w:rPr>
-        <w:t xml:space="preserve">[-0.442, 0.225]</w:t>
-      </w:r>
-    </w:p>
-    <w:p>
-      <w:pPr>
-        <w:pStyle w:val="FirstParagraph"/>
-      </w:pPr>
-      <w:r>
-        <w:t xml:space="preserve">This indicates that the near-ceiling correlations reflected shared variance from action-outcome prediction accuracy under low-noise conditions. The mechanism effect remains meaningful, but the low-noise validation statistic should not be interpreted as independent construct validation.</w:t>
-      </w:r>
-    </w:p>
-    <w:p>
-      <w:pPr>
-        <w:pStyle w:val="BodyText"/>
-      </w:pPr>
-      <w:r>
-        <w:t xml:space="preserve">Boundary self showed the opposite pattern. Workspace dose tracked the internal boundary proxy (</w:t>
-      </w:r>
-      <w:r>
-        <w:rPr>
-          <w:rStyle w:val="VerbatimChar"/>
-        </w:rPr>
-        <w:t xml:space="preserve">n=40</w:t>
-      </w:r>
-      <w:r>
-        <w:t xml:space="preserve">,</w:t>
-      </w:r>
-      <w:r>
-        <w:t xml:space="preserve"> </w:t>
-      </w:r>
-      <w:r>
-        <w:rPr>
-          <w:rStyle w:val="VerbatimChar"/>
-        </w:rPr>
-        <w:t xml:space="preserve">r=0.728</w:t>
-      </w:r>
-      <w:r>
-        <w:t xml:space="preserve">, 95% CI</w:t>
-      </w:r>
-      <w:r>
-        <w:t xml:space="preserve"> </w:t>
-      </w:r>
-      <w:r>
-        <w:rPr>
-          <w:rStyle w:val="VerbatimChar"/>
-        </w:rPr>
         <w:t xml:space="preserve">[0.564, 0.845]</w:t>
       </w:r>
       <w:r>
-        <w:t xml:space="preserve">), but did not converge with independent boundary tests:</w:t>
-      </w:r>
-    </w:p>
-    <w:p>
-      <w:pPr>
-        <w:pStyle w:val="Compact"/>
-        <w:numPr>
-          <w:ilvl w:val="0"/>
-          <w:numId w:val="1021"/>
-        </w:numPr>
-      </w:pPr>
-      <w:r>
-        <w:t xml:space="preserve">generic boundary probe:</w:t>
-      </w:r>
-      <w:r>
-        <w:t xml:space="preserve"> </w:t>
-      </w:r>
-      <w:r>
-        <w:rPr>
-          <w:rStyle w:val="VerbatimChar"/>
-        </w:rPr>
-        <w:t xml:space="preserve">n=40</w:t>
-      </w:r>
-      <w:r>
-        <w:t xml:space="preserve">,</w:t>
-      </w:r>
-      <w:r>
-        <w:t xml:space="preserve"> </w:t>
+        <w:t xml:space="preserve">), but it did not converge with generic boundary probes (</w:t>
       </w:r>
       <w:r>
         <w:rPr>
@@ -3352,43 +3623,7 @@
         <w:t xml:space="preserve">r=0.325</w:t>
       </w:r>
       <w:r>
-        <w:t xml:space="preserve">, 95% CI</w:t>
-      </w:r>
-      <w:r>
-        <w:t xml:space="preserve"> </w:t>
-      </w:r>
-      <w:r>
-        <w:rPr>
-          <w:rStyle w:val="VerbatimChar"/>
-        </w:rPr>
-        <w:t xml:space="preserve">[-0.023, 0.620]</w:t>
-      </w:r>
-    </w:p>
-    <w:p>
-      <w:pPr>
-        <w:pStyle w:val="Compact"/>
-        <w:numPr>
-          <w:ilvl w:val="0"/>
-          <w:numId w:val="1021"/>
-        </w:numPr>
-      </w:pPr>
-      <w:r>
-        <w:t xml:space="preserve">attention-specific hard boundary probe:</w:t>
-      </w:r>
-      <w:r>
-        <w:t xml:space="preserve"> </w:t>
-      </w:r>
-      <w:r>
-        <w:rPr>
-          <w:rStyle w:val="VerbatimChar"/>
-        </w:rPr>
-        <w:t xml:space="preserve">n=40</w:t>
-      </w:r>
-      <w:r>
-        <w:t xml:space="preserve">,</w:t>
-      </w:r>
-      <w:r>
-        <w:t xml:space="preserve"> </w:t>
+        <w:t xml:space="preserve">) or attention-specific hard boundary probes (</w:t>
       </w:r>
       <w:r>
         <w:rPr>
@@ -3397,80 +3632,15 @@
         <w:t xml:space="preserve">r=0.246</w:t>
       </w:r>
       <w:r>
-        <w:t xml:space="preserve">, 95% CI</w:t>
-      </w:r>
-      <w:r>
-        <w:t xml:space="preserve"> </w:t>
-      </w:r>
-      <w:r>
-        <w:rPr>
-          <w:rStyle w:val="VerbatimChar"/>
-        </w:rPr>
-        <w:t xml:space="preserve">[-0.023, 0.520]</w:t>
-      </w:r>
-    </w:p>
-    <w:p>
-      <w:pPr>
-        <w:pStyle w:val="Compact"/>
-        <w:numPr>
-          <w:ilvl w:val="0"/>
-          <w:numId w:val="1021"/>
-        </w:numPr>
-      </w:pPr>
-      <w:r>
-        <w:t xml:space="preserve">workspace dose vs attention-specific hard boundary probe:</w:t>
-      </w:r>
-      <w:r>
-        <w:t xml:space="preserve"> </w:t>
-      </w:r>
-      <w:r>
-        <w:rPr>
-          <w:rStyle w:val="VerbatimChar"/>
-        </w:rPr>
-        <w:t xml:space="preserve">n=40</w:t>
-      </w:r>
-      <w:r>
-        <w:t xml:space="preserve">,</w:t>
-      </w:r>
-      <w:r>
-        <w:t xml:space="preserve"> </w:t>
-      </w:r>
-      <w:r>
-        <w:rPr>
-          <w:rStyle w:val="VerbatimChar"/>
-        </w:rPr>
-        <w:t xml:space="preserve">r=0.223</w:t>
-      </w:r>
-      <w:r>
-        <w:t xml:space="preserve">, 95% CI</w:t>
-      </w:r>
-      <w:r>
-        <w:t xml:space="preserve"> </w:t>
-      </w:r>
-      <w:r>
-        <w:rPr>
-          <w:rStyle w:val="VerbatimChar"/>
-        </w:rPr>
-        <w:t xml:space="preserve">[-0.049, 0.514]</w:t>
-      </w:r>
-    </w:p>
-    <w:p>
-      <w:pPr>
-        <w:pStyle w:val="FirstParagraph"/>
-      </w:pPr>
-      <w:r>
-        <w:t xml:space="preserve">The Transformer result therefore supports a conservative interpretation: action-loop mechanisms generalize well to an attention-based substrate, but boundary self remains measurement-limited in the current Transformer implementation. Workspace memory changes internal state, yet those changes do not currently translate into behaviorally or attentionally validated boundary maintenance.</w:t>
-      </w:r>
-    </w:p>
-    <w:p>
-      <w:pPr>
-        <w:pStyle w:val="BodyText"/>
-      </w:pPr>
-      <w:r>
-        <w:t xml:space="preserve">An exploratory construct-variant mini-study then asked whether Transformer-specific self might appear as either attention-focus self or context-window self. Neither candidate validated: attention-focus self had proxy-test convergence of</w:t>
-      </w:r>
-      <w:r>
-        <w:t xml:space="preserve"> </w:t>
+        <w:t xml:space="preserve">). This result therefore supports a conservative interpretation: action-loop mechanisms generalize well to an attention-based substrate, but boundary self remains measurement-limited in the current minimal attention implementation. Workspace memory changes internal state, yet those changes do not currently translate into behaviorally or attentionally validated boundary maintenance.</w:t>
+      </w:r>
+    </w:p>
+    <w:p>
+      <w:pPr>
+        <w:pStyle w:val="BodyText"/>
+      </w:pPr>
+      <w:r>
+        <w:t xml:space="preserve">Exploratory construct-variant tests also remained outside the validated set. Attention-focus self (</w:t>
       </w:r>
       <w:r>
         <w:rPr>
@@ -3479,10 +3649,7 @@
         <w:t xml:space="preserve">r=0.203</w:t>
       </w:r>
       <w:r>
-        <w:t xml:space="preserve">, while context-window self had proxy-test convergence of</w:t>
-      </w:r>
-      <w:r>
-        <w:t xml:space="preserve"> </w:t>
+        <w:t xml:space="preserve">) and context-window self (</w:t>
       </w:r>
       <w:r>
         <w:rPr>
@@ -3491,24 +3658,7 @@
         <w:t xml:space="preserve">r=0.152</w:t>
       </w:r>
       <w:r>
-        <w:t xml:space="preserve">. Context-window dose showed only a weak relation to the independent test (</w:t>
-      </w:r>
-      <w:r>
-        <w:rPr>
-          <w:rStyle w:val="VerbatimChar"/>
-        </w:rPr>
-        <w:t xml:space="preserve">r=0.341</w:t>
-      </w:r>
-      <w:r>
-        <w:t xml:space="preserve">).</w:t>
-      </w:r>
-    </w:p>
-    <w:p>
-      <w:pPr>
-        <w:pStyle w:val="BodyText"/>
-      </w:pPr>
-      <w:r>
-        <w:t xml:space="preserve">The more informative pattern was a high-agency / low-boundary profile. Across the agency-boundary grid,</w:t>
+        <w:t xml:space="preserve">) did not validate as attention-specific alternatives. A high-agency / low-boundary profile appeared in</w:t>
       </w:r>
       <w:r>
         <w:t xml:space="preserve"> </w:t>
@@ -3532,25 +3682,7 @@
         <w:t xml:space="preserve">37.5%</w:t>
       </w:r>
       <w:r>
-        <w:t xml:space="preserve">) met the criterion of high independent agency (</w:t>
-      </w:r>
-      <w:r>
-        <w:rPr>
-          <w:rStyle w:val="VerbatimChar"/>
-        </w:rPr>
-        <w:t xml:space="preserve">&gt;=0.70</w:t>
-      </w:r>
-      <w:r>
-        <w:t xml:space="preserve">) and low independent boundary score (</w:t>
-      </w:r>
-      <w:r>
-        <w:rPr>
-          <w:rStyle w:val="VerbatimChar"/>
-        </w:rPr>
-        <w:t xml:space="preserve">&lt;0.50</w:t>
-      </w:r>
-      <w:r>
-        <w:t xml:space="preserve">). Independent agency and independent boundary scores were largely dissociated (</w:t>
+        <w:t xml:space="preserve">), with independent agency and boundary scores largely dissociated (</w:t>
       </w:r>
       <w:r>
         <w:rPr>
@@ -3559,23 +3691,15 @@
         <w:t xml:space="preserve">r=0.129</w:t>
       </w:r>
       <w:r>
-        <w:t xml:space="preserve">). This should not be upgraded to a new validated self construct. It is better treated as an architecture-conditioned profile: Transformer-like systems can show strong predictive agency while failing current boundary-self validation.</w:t>
-      </w:r>
-    </w:p>
-    <w:p>
-      <w:pPr>
-        <w:pStyle w:val="BodyText"/>
-      </w:pPr>
-      <w:r>
-        <w:t xml:space="preserve">Within the Transformer follow-up, boundary self, attention-focus self, context-window self, and the high-agency / low-boundary profile remain outside the strong mechanism claims. These items are retained as architecture-conditioned targets for future measurement work rather than reported as validated constructs.</w:t>
-      </w:r>
-    </w:p>
-    <w:p>
-      <w:pPr>
-        <w:pStyle w:val="BodyText"/>
-      </w:pPr>
-      <w:r>
-        <w:t xml:space="preserve">Extended Transformer validation and workspace capacity sweeps are reported in Supplementary Sections S2 and S3.</w:t>
+        <w:t xml:space="preserve">). This profile is best treated as an architecture-conditioned diagnostic pattern, not as a new validated self construct.</w:t>
+      </w:r>
+    </w:p>
+    <w:p>
+      <w:pPr>
+        <w:pStyle w:val="BodyText"/>
+      </w:pPr>
+      <w:r>
+        <w:t xml:space="preserve">Extended minimal attention validation, workspace capacity sweeps, and detailed attention-substrate diagnostic tables are reported in Supplementary Sections S2-S4.</w:t>
       </w:r>
     </w:p>
     <w:bookmarkEnd w:id="49"/>
@@ -3690,7 +3814,7 @@
         <w:pStyle w:val="BodyText"/>
       </w:pPr>
       <w:r>
-        <w:t xml:space="preserve">The Transformer follow-up adds the complementary lesson. Architecture-specific testing did not rescue boundary self. Instead, it showed that the internal workspace proxy could respond strongly to workspace dose while failing independent boundary probes. This is not merely a negative result. It suggests that some constructs may require architectural prerequisites. A Transformer-like attention substrate can express action-outcome agency and ownership-like operational signals when action loops are added, but it may not implement the kind of boundary-maintenance behavior measured in thalamus-inspired or embodied systems.</w:t>
+        <w:t xml:space="preserve">The minimal attention follow-up adds the complementary lesson. Architecture-specific testing did not rescue boundary self. Instead, it showed that the internal workspace proxy could respond strongly to workspace dose while failing independent boundary probes. This suggests that some constructs may require architectural prerequisites. An attention-based substrate can express action-outcome agency and ownership-like operational signals when action loops are added, but it may not implement the kind of boundary-maintenance behavior measured in thalamus-inspired or embodied systems.</w:t>
       </w:r>
     </w:p>
     <w:bookmarkEnd w:id="53"/>
@@ -3708,7 +3832,7 @@
         <w:pStyle w:val="FirstParagraph"/>
       </w:pPr>
       <w:r>
-        <w:t xml:space="preserve">The Transformer mini-study suggests that construct discovery should be architecture-conditioned rather than universal by default. Two intuitive candidates failed: attention-focus self did not validate (</w:t>
+        <w:t xml:space="preserve">The attention-substrate mini-study suggests that construct discovery should be architecture-conditioned rather than universal by default. Two intuitive candidates failed: attention-focus self did not validate (</w:t>
       </w:r>
       <w:r>
         <w:rPr>
@@ -3734,7 +3858,7 @@
         <w:pStyle w:val="BodyText"/>
       </w:pPr>
       <w:r>
-        <w:t xml:space="preserve">The strongest Transformer-specific pattern was instead a dissociation profile: predictive agency without validated boundary self. In the agency-boundary grid,</w:t>
+        <w:t xml:space="preserve">The strongest attention-substrate pattern was instead a dissociation profile: predictive agency without validated boundary self. In the agency-boundary grid,</w:t>
       </w:r>
       <w:r>
         <w:t xml:space="preserve"> </w:t>
@@ -3758,7 +3882,7 @@
         <w:t xml:space="preserve">r=0.129</w:t>
       </w:r>
       <w:r>
-        <w:t xml:space="preserve">). This profile is not a phenomenological claim that a Transformer</w:t>
+        <w:t xml:space="preserve">). This profile is not a phenomenological claim that a model</w:t>
       </w:r>
       <w:r>
         <w:t xml:space="preserve"> </w:t>
@@ -3770,23 +3894,23 @@
         <w:t xml:space="preserve"> </w:t>
       </w:r>
       <w:r>
-        <w:t xml:space="preserve">The safer interpretation is operational: action-outcome prediction can be strong in an attention-based substrate even when boundary-maintenance probes fail.</w:t>
-      </w:r>
-    </w:p>
-    <w:p>
-      <w:pPr>
-        <w:pStyle w:val="BodyText"/>
-      </w:pPr>
-      <w:r>
-        <w:t xml:space="preserve">This should also not be read as evidence that Transformer-like systems lack all possible self-related constructs. The present tests address boundary self as operationalized here. Other self-like constructs may require different tasks, longer temporal structure, or different architectural probes. Comparisons to human flow states, automatic action, or meditative reports are therefore heuristic analogies rather than evidence.</w:t>
-      </w:r>
-    </w:p>
-    <w:p>
-      <w:pPr>
-        <w:pStyle w:val="BodyText"/>
-      </w:pPr>
-      <w:r>
-        <w:t xml:space="preserve">This matters theoretically because it extends the original dissociation. The main experiments showed that workspace-like, action-loop, and meta-monitor mechanisms can be separately manipulated. The Transformer profile suggests a further possibility: some architectures may naturally occupy regions of construct space where one operational component is strong and another is absent or unmeasurable. The construct space therefore needs to be conditioned on architecture, with explicit records of where validation succeeded, where measurement was limited, and where architecture-specific variants emerged.</w:t>
+        <w:t xml:space="preserve">The safer interpretation is measurement-level: action-outcome prediction can be strong in an attention-based substrate even when boundary-maintenance probes fail.</w:t>
+      </w:r>
+    </w:p>
+    <w:p>
+      <w:pPr>
+        <w:pStyle w:val="BodyText"/>
+      </w:pPr>
+      <w:r>
+        <w:t xml:space="preserve">This should also not be read as evidence that attention-based systems lack all possible self-related constructs. The present tests address boundary self as operationalized here. Other self-like constructs may require different tasks, longer temporal structure, or different architectural probes. Comparisons to human flow states, automatic action, or meditative reports are therefore heuristic analogies rather than evidence.</w:t>
+      </w:r>
+    </w:p>
+    <w:p>
+      <w:pPr>
+        <w:pStyle w:val="BodyText"/>
+      </w:pPr>
+      <w:r>
+        <w:t xml:space="preserve">This matters theoretically because it extends the original dissociation. The main experiments showed that workspace-like, action-loop, and meta-monitor mechanisms can be separately manipulated. The attention-substrate profile suggests a further possibility: some architectures may naturally occupy regions of construct space where one measured component is strong and another is absent or unmeasurable. The construct space therefore needs to be conditioned on architecture, with explicit records of where validation succeeded, where measurement was limited, and where architecture-specific variants emerged.</w:t>
       </w:r>
     </w:p>
     <w:bookmarkEnd w:id="54"/>
@@ -3812,6 +3936,35 @@
         <w:pStyle w:val="BodyText"/>
       </w:pPr>
       <w:r>
+        <w:t xml:space="preserve">Very high convergence should also be interpreted carefully. The primary action-ownership result (</w:t>
+      </w:r>
+      <w:r>
+        <w:rPr>
+          <w:rStyle w:val="VerbatimChar"/>
+        </w:rPr>
+        <w:t xml:space="preserve">r=0.996</w:t>
+      </w:r>
+      <w:r>
+        <w:t xml:space="preserve">) supports a stable operational relation between attribution proxy and ownership tests, but its near-deterministic range also limits the evidential value of the numerical magnitude. In this case, the relevant claim is not that action ownership is</w:t>
+      </w:r>
+      <w:r>
+        <w:t xml:space="preserve"> </w:t>
+      </w:r>
+      <w:r>
+        <w:t xml:space="preserve">“perfectly”</w:t>
+      </w:r>
+      <w:r>
+        <w:t xml:space="preserve"> </w:t>
+      </w:r>
+      <w:r>
+        <w:t xml:space="preserve">validated; it is that action-attribution and forced-choice/illusion-resistance probes move together under the action-loop manipulation. The minimal attention stress tests make the same caution explicit: near-ceiling correlations can reflect shared task variance under clean conditions. Over-convergence is therefore a measurement warning sign as well as a sign of reliability.</w:t>
+      </w:r>
+    </w:p>
+    <w:p>
+      <w:pPr>
+        <w:pStyle w:val="BodyText"/>
+      </w:pPr>
+      <w:r>
         <w:t xml:space="preserve">This distinction is important for computational models of consciousness-related constructs. The validated constructs are suitable for comparing architectures, diagnosing measurement failures, and testing mechanism sensitivity. They are not sufficient for attributing experience. The correct claim is that some systems satisfy validated operational criteria for action agency, boundary maintenance, identity persistence, action ownership, or distributed body-schema tracking.</w:t>
       </w:r>
     </w:p>
@@ -3838,15 +3991,15 @@
         <w:pStyle w:val="BodyText"/>
       </w:pPr>
       <w:r>
-        <w:t xml:space="preserve">A second limitation is scope. Body ownership and trajectory consistency remain exploratory: body ownership lacked convergent proxy-test evidence, and trajectory consistency did not align with the validated identity-temporal construct. Transformer boundary self also remains measurement-limited: workspace manipulations affect an internal boundary proxy, but not the current behavior-level or attention-boundary probes. The high-agency / low-boundary Transformer profile is therefore best treated as an architecture-conditioned diagnostic pattern, not as a new validated construct. The Transformer analyses were conducted as a post-hoc generalization test rather than as part of the primary analyses and should be evaluated separately.</w:t>
-      </w:r>
-    </w:p>
-    <w:p>
-      <w:pPr>
-        <w:pStyle w:val="BodyText"/>
-      </w:pPr>
-      <w:r>
-        <w:t xml:space="preserve">Future work should focus on two directions. One is measurement expansion: stronger multisensory tests for body ownership, separate treatment of trajectory consistency, and biological or phenomenological cross-validation of the operational constructs. The other is architectural generalization: testing whether high-agency / low-boundary profiles persist in larger Transformer-like systems and using the artificial-life archive to search for naturally emerging dissociations. The benchmark package now includes architecture metadata for constructs; extending this metadata as new systems are tested is a practical route toward an architecture-conditioned construct library.</w:t>
+        <w:t xml:space="preserve">A second limitation is scope. Body ownership and trajectory consistency remain exploratory: body ownership lacked convergent proxy-test evidence, and trajectory consistency did not align with the validated identity-temporal construct. Attention-based boundary self also remains measurement-limited: workspace manipulations affect an internal boundary proxy, but not the current behavior-level or attention-boundary probes. The high-agency / low-boundary attention-substrate profile is therefore best treated as an architecture-conditioned diagnostic pattern, not as a new validated construct. The minimal attention analyses were conducted as a post-hoc generalization test rather than as part of the primary analyses and should be evaluated separately.</w:t>
+      </w:r>
+    </w:p>
+    <w:p>
+      <w:pPr>
+        <w:pStyle w:val="BodyText"/>
+      </w:pPr>
+      <w:r>
+        <w:t xml:space="preserve">Future work should focus on two directions. One is measurement expansion: stronger multisensory tests for body ownership, separate treatment of trajectory consistency, and biological or phenomenological cross-validation of the validated constructs. The other is architectural generalization: testing whether high-agency / low-boundary profiles persist in larger attention-based systems and using the artificial-life archive to search for naturally emerging dissociations. The benchmark package now includes architecture metadata for constructs; extending this metadata as new systems are tested is a practical route toward an architecture-conditioned construct library.</w:t>
       </w:r>
     </w:p>
     <w:bookmarkEnd w:id="56"/>
@@ -3865,7 +4018,7 @@
         <w:pStyle w:val="FirstParagraph"/>
       </w:pPr>
       <w:r>
-        <w:t xml:space="preserve">This work shows that operational proxies in computational models of consciousness-related constructs can fail systematically, even when theoretically motivated. Treating failure diagnostically allowed us to refine constructs, validate five operational measures, and identify dissociable computational substrates. Workspace, action-outcome, and meta-monitoring mechanisms supported different validated constructs, while Transformer follow-ups showed that mechanism generalization and construct validation can diverge. The broader lesson is methodological: measurement validation is not a post-hoc check; it is a prerequisite for mechanistic interpretation.</w:t>
+        <w:t xml:space="preserve">This work shows that operational proxies in computational models of consciousness-related constructs can fail systematically, even when theoretically motivated. Treating failure diagnostically allowed us to refine constructs, validate five measures, and identify dissociable computational substrates. Workspace, action-outcome, and meta-monitoring mechanisms supported different validated constructs, while minimal attention follow-ups showed that mechanism generalization and construct validation can diverge. The broader lesson is methodological: measurement validation is not a post-hoc check; it is a prerequisite for mechanistic interpretation.</w:t>
       </w:r>
     </w:p>
     <w:bookmarkEnd w:id="58"/>
@@ -3883,7 +4036,7 @@
         <w:pStyle w:val="FirstParagraph"/>
       </w:pPr>
       <w:r>
-        <w:t xml:space="preserve">Baars, B. J. (1988).</w:t>
+        <w:t xml:space="preserve">Albantakis, L., Barbosa, L., Findlay, G., Grasso, M., Haun, A. M., Marshall, W., Mayner, W. G. P., Zaeemzadeh, A., Boly, M., Juel, B. E., Sasai, S., Fujii, K., David, I., Hendren, J., Lang, J. P., &amp; Tononi, G. (2023). Integrated Information Theory (IIT) 4.0: Formulating the properties of phenomenal existence in physical terms.</w:t>
       </w:r>
       <w:r>
         <w:t xml:space="preserve"> </w:t>
@@ -3893,18 +4046,18 @@
           <w:i/>
           <w:iCs/>
         </w:rPr>
-        <w:t xml:space="preserve">A cognitive theory of consciousness</w:t>
-      </w:r>
-      <w:r>
-        <w:t xml:space="preserve">. Cambridge University Press.</w:t>
-      </w:r>
-    </w:p>
-    <w:p>
-      <w:pPr>
-        <w:pStyle w:val="BodyText"/>
-      </w:pPr>
-      <w:r>
-        <w:t xml:space="preserve">Blanke, O., &amp; Metzinger, T. (2009). Full-body illusions and minimal phenomenal selfhood.</w:t>
+        <w:t xml:space="preserve">PLOS Computational Biology</w:t>
+      </w:r>
+      <w:r>
+        <w:t xml:space="preserve">, 19(10), e1011465.</w:t>
+      </w:r>
+    </w:p>
+    <w:p>
+      <w:pPr>
+        <w:pStyle w:val="BodyText"/>
+      </w:pPr>
+      <w:r>
+        <w:t xml:space="preserve">Baars, B. J. (1988).</w:t>
       </w:r>
       <w:r>
         <w:t xml:space="preserve"> </w:t>
@@ -3914,18 +4067,18 @@
           <w:i/>
           <w:iCs/>
         </w:rPr>
-        <w:t xml:space="preserve">Trends in Cognitive Sciences</w:t>
-      </w:r>
-      <w:r>
-        <w:t xml:space="preserve">, 13(1), 7-13.</w:t>
-      </w:r>
-    </w:p>
-    <w:p>
-      <w:pPr>
-        <w:pStyle w:val="BodyText"/>
-      </w:pPr>
-      <w:r>
-        <w:t xml:space="preserve">Borsboom, D., Mellenbergh, G. J., &amp; van Heerden, J. (2004). The concept of validity.</w:t>
+        <w:t xml:space="preserve">A cognitive theory of consciousness</w:t>
+      </w:r>
+      <w:r>
+        <w:t xml:space="preserve">. Cambridge University Press.</w:t>
+      </w:r>
+    </w:p>
+    <w:p>
+      <w:pPr>
+        <w:pStyle w:val="BodyText"/>
+      </w:pPr>
+      <w:r>
+        <w:t xml:space="preserve">Blanke, O., &amp; Metzinger, T. (2009). Full-body illusions and minimal phenomenal selfhood.</w:t>
       </w:r>
       <w:r>
         <w:t xml:space="preserve"> </w:t>
@@ -3935,18 +4088,18 @@
           <w:i/>
           <w:iCs/>
         </w:rPr>
-        <w:t xml:space="preserve">Psychological Review</w:t>
-      </w:r>
-      <w:r>
-        <w:t xml:space="preserve">, 111(4), 1061-1071.</w:t>
-      </w:r>
-    </w:p>
-    <w:p>
-      <w:pPr>
-        <w:pStyle w:val="BodyText"/>
-      </w:pPr>
-      <w:r>
-        <w:t xml:space="preserve">Campbell, D. T., &amp; Fiske, D. W. (1959). Convergent and discriminant validation by the multitrait-multimethod matrix.</w:t>
+        <w:t xml:space="preserve">Trends in Cognitive Sciences</w:t>
+      </w:r>
+      <w:r>
+        <w:t xml:space="preserve">, 13(1), 7-13.</w:t>
+      </w:r>
+    </w:p>
+    <w:p>
+      <w:pPr>
+        <w:pStyle w:val="BodyText"/>
+      </w:pPr>
+      <w:r>
+        <w:t xml:space="preserve">Borsboom, D., Mellenbergh, G. J., &amp; van Heerden, J. (2004). The concept of validity.</w:t>
       </w:r>
       <w:r>
         <w:t xml:space="preserve"> </w:t>
@@ -3956,18 +4109,18 @@
           <w:i/>
           <w:iCs/>
         </w:rPr>
-        <w:t xml:space="preserve">Psychological Bulletin</w:t>
-      </w:r>
-      <w:r>
-        <w:t xml:space="preserve">, 56(2), 81-105.</w:t>
-      </w:r>
-    </w:p>
-    <w:p>
-      <w:pPr>
-        <w:pStyle w:val="BodyText"/>
-      </w:pPr>
-      <w:r>
-        <w:t xml:space="preserve">Cronbach, L. J., &amp; Meehl, P. E. (1955). Construct validity in psychological tests.</w:t>
+        <w:t xml:space="preserve">Psychological Review</w:t>
+      </w:r>
+      <w:r>
+        <w:t xml:space="preserve">, 111(4), 1061-1071.</w:t>
+      </w:r>
+    </w:p>
+    <w:p>
+      <w:pPr>
+        <w:pStyle w:val="BodyText"/>
+      </w:pPr>
+      <w:r>
+        <w:t xml:space="preserve">Butlin, P., Long, R., Elmoznino, E., Bengio, Y., Birch, J., Constant, A., Deane, G., Fleming, S. M., Frith, C., Ji, X., Kanai, R., Klein, C., Lindsay, G., Michel, M., Mudrik, L., Peters, M. A. K., Schwitzgebel, E., Simon, J., &amp; VanRullen, R. (2023). Consciousness in artificial intelligence: Insights from the science of consciousness.</w:t>
       </w:r>
       <w:r>
         <w:t xml:space="preserve"> </w:t>
@@ -3977,18 +4130,18 @@
           <w:i/>
           <w:iCs/>
         </w:rPr>
-        <w:t xml:space="preserve">Psychological Bulletin</w:t>
-      </w:r>
-      <w:r>
-        <w:t xml:space="preserve">, 52(4), 281-302.</w:t>
-      </w:r>
-    </w:p>
-    <w:p>
-      <w:pPr>
-        <w:pStyle w:val="BodyText"/>
-      </w:pPr>
-      <w:r>
-        <w:t xml:space="preserve">Dehaene, S., &amp; Changeux, J.-P. (2011). Experimental and theoretical approaches to conscious processing.</w:t>
+        <w:t xml:space="preserve">arXiv:2308.08708</w:t>
+      </w:r>
+      <w:r>
+        <w:t xml:space="preserve">.</w:t>
+      </w:r>
+    </w:p>
+    <w:p>
+      <w:pPr>
+        <w:pStyle w:val="BodyText"/>
+      </w:pPr>
+      <w:r>
+        <w:t xml:space="preserve">Campbell, D. T., &amp; Fiske, D. W. (1959). Convergent and discriminant validation by the multitrait-multimethod matrix.</w:t>
       </w:r>
       <w:r>
         <w:t xml:space="preserve"> </w:t>
@@ -3998,18 +4151,18 @@
           <w:i/>
           <w:iCs/>
         </w:rPr>
-        <w:t xml:space="preserve">Neuron</w:t>
-      </w:r>
-      <w:r>
-        <w:t xml:space="preserve">, 70(2), 200-227.</w:t>
-      </w:r>
-    </w:p>
-    <w:p>
-      <w:pPr>
-        <w:pStyle w:val="BodyText"/>
-      </w:pPr>
-      <w:r>
-        <w:t xml:space="preserve">Friston, K. (2010). The free-energy principle: a unified brain theory?</w:t>
+        <w:t xml:space="preserve">Psychological Bulletin</w:t>
+      </w:r>
+      <w:r>
+        <w:t xml:space="preserve">, 56(2), 81-105.</w:t>
+      </w:r>
+    </w:p>
+    <w:p>
+      <w:pPr>
+        <w:pStyle w:val="BodyText"/>
+      </w:pPr>
+      <w:r>
+        <w:t xml:space="preserve">Chalmers, D. J. (2023). Could a large language model be conscious?</w:t>
       </w:r>
       <w:r>
         <w:t xml:space="preserve"> </w:t>
@@ -4019,18 +4172,18 @@
           <w:i/>
           <w:iCs/>
         </w:rPr>
-        <w:t xml:space="preserve">Nature Reviews Neuroscience</w:t>
-      </w:r>
-      <w:r>
-        <w:t xml:space="preserve">, 11(2), 127-138.</w:t>
-      </w:r>
-    </w:p>
-    <w:p>
-      <w:pPr>
-        <w:pStyle w:val="BodyText"/>
-      </w:pPr>
-      <w:r>
-        <w:t xml:space="preserve">Gallagher, S. (2000). Philosophical conceptions of the self: implications for cognitive science.</w:t>
+        <w:t xml:space="preserve">Boston Review</w:t>
+      </w:r>
+      <w:r>
+        <w:t xml:space="preserve">.</w:t>
+      </w:r>
+    </w:p>
+    <w:p>
+      <w:pPr>
+        <w:pStyle w:val="BodyText"/>
+      </w:pPr>
+      <w:r>
+        <w:t xml:space="preserve">Cronbach, L. J., &amp; Meehl, P. E. (1955). Construct validity in psychological tests.</w:t>
       </w:r>
       <w:r>
         <w:t xml:space="preserve"> </w:t>
@@ -4040,18 +4193,18 @@
           <w:i/>
           <w:iCs/>
         </w:rPr>
-        <w:t xml:space="preserve">Trends in Cognitive Sciences</w:t>
-      </w:r>
-      <w:r>
-        <w:t xml:space="preserve">, 4(1), 14-21.</w:t>
-      </w:r>
-    </w:p>
-    <w:p>
-      <w:pPr>
-        <w:pStyle w:val="BodyText"/>
-      </w:pPr>
-      <w:r>
-        <w:t xml:space="preserve">Gamez, D. (2008). Progress in machine consciousness.</w:t>
+        <w:t xml:space="preserve">Psychological Bulletin</w:t>
+      </w:r>
+      <w:r>
+        <w:t xml:space="preserve">, 52(4), 281-302.</w:t>
+      </w:r>
+    </w:p>
+    <w:p>
+      <w:pPr>
+        <w:pStyle w:val="BodyText"/>
+      </w:pPr>
+      <w:r>
+        <w:t xml:space="preserve">Dehaene, S., &amp; Changeux, J.-P. (2011). Experimental and theoretical approaches to conscious processing.</w:t>
       </w:r>
       <w:r>
         <w:t xml:space="preserve"> </w:t>
@@ -4061,18 +4214,18 @@
           <w:i/>
           <w:iCs/>
         </w:rPr>
-        <w:t xml:space="preserve">Consciousness and Cognition</w:t>
-      </w:r>
-      <w:r>
-        <w:t xml:space="preserve">, 17(3), 887-910.</w:t>
-      </w:r>
-    </w:p>
-    <w:p>
-      <w:pPr>
-        <w:pStyle w:val="BodyText"/>
-      </w:pPr>
-      <w:r>
-        <w:t xml:space="preserve">Haladjian, H. H., &amp; Montemayor, C. (2016). Artificial consciousness and the consciousness-attention dissociation.</w:t>
+        <w:t xml:space="preserve">Neuron</w:t>
+      </w:r>
+      <w:r>
+        <w:t xml:space="preserve">, 70(2), 200-227.</w:t>
+      </w:r>
+    </w:p>
+    <w:p>
+      <w:pPr>
+        <w:pStyle w:val="BodyText"/>
+      </w:pPr>
+      <w:r>
+        <w:t xml:space="preserve">Friston, K. (2010). The free-energy principle: a unified brain theory?</w:t>
       </w:r>
       <w:r>
         <w:t xml:space="preserve"> </w:t>
@@ -4082,18 +4235,18 @@
           <w:i/>
           <w:iCs/>
         </w:rPr>
-        <w:t xml:space="preserve">Consciousness and Cognition</w:t>
-      </w:r>
-      <w:r>
-        <w:t xml:space="preserve">, 45, 210-225.</w:t>
-      </w:r>
-    </w:p>
-    <w:p>
-      <w:pPr>
-        <w:pStyle w:val="BodyText"/>
-      </w:pPr>
-      <w:r>
-        <w:t xml:space="preserve">Haggard, P., Clark, S., &amp; Kalogeras, J. (2002). Voluntary action and conscious awareness.</w:t>
+        <w:t xml:space="preserve">Nature Reviews Neuroscience</w:t>
+      </w:r>
+      <w:r>
+        <w:t xml:space="preserve">, 11(2), 127-138.</w:t>
+      </w:r>
+    </w:p>
+    <w:p>
+      <w:pPr>
+        <w:pStyle w:val="BodyText"/>
+      </w:pPr>
+      <w:r>
+        <w:t xml:space="preserve">Gallagher, S. (2000). Philosophical conceptions of the self: implications for cognitive science.</w:t>
       </w:r>
       <w:r>
         <w:t xml:space="preserve"> </w:t>
@@ -4103,18 +4256,18 @@
           <w:i/>
           <w:iCs/>
         </w:rPr>
-        <w:t xml:space="preserve">Nature Neuroscience</w:t>
-      </w:r>
-      <w:r>
-        <w:t xml:space="preserve">, 5(4), 382-385.</w:t>
-      </w:r>
-    </w:p>
-    <w:p>
-      <w:pPr>
-        <w:pStyle w:val="BodyText"/>
-      </w:pPr>
-      <w:r>
-        <w:t xml:space="preserve">Moore, J. W., &amp; Fletcher, P. C. (2012). Sense of agency in health and disease: a review of cue integration approaches.</w:t>
+        <w:t xml:space="preserve">Trends in Cognitive Sciences</w:t>
+      </w:r>
+      <w:r>
+        <w:t xml:space="preserve">, 4(1), 14-21.</w:t>
+      </w:r>
+    </w:p>
+    <w:p>
+      <w:pPr>
+        <w:pStyle w:val="BodyText"/>
+      </w:pPr>
+      <w:r>
+        <w:t xml:space="preserve">Gamez, D. (2008). Progress in machine consciousness.</w:t>
       </w:r>
       <w:r>
         <w:t xml:space="preserve"> </w:t>
@@ -4127,15 +4280,15 @@
         <w:t xml:space="preserve">Consciousness and Cognition</w:t>
       </w:r>
       <w:r>
-        <w:t xml:space="preserve">, 21(1), 59-68.</w:t>
-      </w:r>
-    </w:p>
-    <w:p>
-      <w:pPr>
-        <w:pStyle w:val="BodyText"/>
-      </w:pPr>
-      <w:r>
-        <w:t xml:space="preserve">Reggia, J. A. (2013). The rise of machine consciousness: Studying consciousness with computational models.</w:t>
+        <w:t xml:space="preserve">, 17(3), 887-910.</w:t>
+      </w:r>
+    </w:p>
+    <w:p>
+      <w:pPr>
+        <w:pStyle w:val="BodyText"/>
+      </w:pPr>
+      <w:r>
+        <w:t xml:space="preserve">Haladjian, H. H., &amp; Montemayor, C. (2016). Artificial consciousness and the consciousness-attention dissociation.</w:t>
       </w:r>
       <w:r>
         <w:t xml:space="preserve"> </w:t>
@@ -4145,18 +4298,18 @@
           <w:i/>
           <w:iCs/>
         </w:rPr>
-        <w:t xml:space="preserve">Neural Networks</w:t>
-      </w:r>
-      <w:r>
-        <w:t xml:space="preserve">, 44, 112-131.</w:t>
-      </w:r>
-    </w:p>
-    <w:p>
-      <w:pPr>
-        <w:pStyle w:val="BodyText"/>
-      </w:pPr>
-      <w:r>
-        <w:t xml:space="preserve">Seth, A. K. (2013). Interoceptive inference, emotion, and the embodied self.</w:t>
+        <w:t xml:space="preserve">Consciousness and Cognition</w:t>
+      </w:r>
+      <w:r>
+        <w:t xml:space="preserve">, 45, 210-225.</w:t>
+      </w:r>
+    </w:p>
+    <w:p>
+      <w:pPr>
+        <w:pStyle w:val="BodyText"/>
+      </w:pPr>
+      <w:r>
+        <w:t xml:space="preserve">Haggard, P., Clark, S., &amp; Kalogeras, J. (2002). Voluntary action and conscious awareness.</w:t>
       </w:r>
       <w:r>
         <w:t xml:space="preserve"> </w:t>
@@ -4166,10 +4319,136 @@
           <w:i/>
           <w:iCs/>
         </w:rPr>
+        <w:t xml:space="preserve">Nature Neuroscience</w:t>
+      </w:r>
+      <w:r>
+        <w:t xml:space="preserve">, 5(4), 382-385.</w:t>
+      </w:r>
+    </w:p>
+    <w:p>
+      <w:pPr>
+        <w:pStyle w:val="BodyText"/>
+      </w:pPr>
+      <w:r>
+        <w:t xml:space="preserve">Lipton, Z. C. (2018). The mythos of model interpretability.</w:t>
+      </w:r>
+      <w:r>
+        <w:t xml:space="preserve"> </w:t>
+      </w:r>
+      <w:r>
+        <w:rPr>
+          <w:i/>
+          <w:iCs/>
+        </w:rPr>
+        <w:t xml:space="preserve">Communications of the ACM</w:t>
+      </w:r>
+      <w:r>
+        <w:t xml:space="preserve">, 61(10), 36-43.</w:t>
+      </w:r>
+    </w:p>
+    <w:p>
+      <w:pPr>
+        <w:pStyle w:val="BodyText"/>
+      </w:pPr>
+      <w:r>
+        <w:t xml:space="preserve">Long, R., Sebo, J., Butlin, P., Finlinson, K., Fish, K., Harding, J., Pfau, J., Sims, T., Birch, J., &amp; Chalmers, D. (2024). Taking AI welfare seriously.</w:t>
+      </w:r>
+      <w:r>
+        <w:t xml:space="preserve"> </w:t>
+      </w:r>
+      <w:r>
+        <w:rPr>
+          <w:i/>
+          <w:iCs/>
+        </w:rPr>
+        <w:t xml:space="preserve">arXiv:2411.00986</w:t>
+      </w:r>
+      <w:r>
+        <w:t xml:space="preserve">.</w:t>
+      </w:r>
+    </w:p>
+    <w:p>
+      <w:pPr>
+        <w:pStyle w:val="BodyText"/>
+      </w:pPr>
+      <w:r>
+        <w:t xml:space="preserve">Moore, J. W., &amp; Fletcher, P. C. (2012). Sense of agency in health and disease: a review of cue integration approaches.</w:t>
+      </w:r>
+      <w:r>
+        <w:t xml:space="preserve"> </w:t>
+      </w:r>
+      <w:r>
+        <w:rPr>
+          <w:i/>
+          <w:iCs/>
+        </w:rPr>
+        <w:t xml:space="preserve">Consciousness and Cognition</w:t>
+      </w:r>
+      <w:r>
+        <w:t xml:space="preserve">, 21(1), 59-68.</w:t>
+      </w:r>
+    </w:p>
+    <w:p>
+      <w:pPr>
+        <w:pStyle w:val="BodyText"/>
+      </w:pPr>
+      <w:r>
+        <w:t xml:space="preserve">Reggia, J. A. (2013). The rise of machine consciousness: Studying consciousness with computational models.</w:t>
+      </w:r>
+      <w:r>
+        <w:t xml:space="preserve"> </w:t>
+      </w:r>
+      <w:r>
+        <w:rPr>
+          <w:i/>
+          <w:iCs/>
+        </w:rPr>
+        <w:t xml:space="preserve">Neural Networks</w:t>
+      </w:r>
+      <w:r>
+        <w:t xml:space="preserve">, 44, 112-131.</w:t>
+      </w:r>
+    </w:p>
+    <w:p>
+      <w:pPr>
+        <w:pStyle w:val="BodyText"/>
+      </w:pPr>
+      <w:r>
+        <w:t xml:space="preserve">Seth, A. K. (2013). Interoceptive inference, emotion, and the embodied self.</w:t>
+      </w:r>
+      <w:r>
+        <w:t xml:space="preserve"> </w:t>
+      </w:r>
+      <w:r>
+        <w:rPr>
+          <w:i/>
+          <w:iCs/>
+        </w:rPr>
         <w:t xml:space="preserve">Trends in Cognitive Sciences</w:t>
       </w:r>
       <w:r>
         <w:t xml:space="preserve">, 17(11), 565-573.</w:t>
+      </w:r>
+    </w:p>
+    <w:p>
+      <w:pPr>
+        <w:pStyle w:val="BodyText"/>
+      </w:pPr>
+      <w:r>
+        <w:t xml:space="preserve">Shardlow, M., &amp; Przybyla, P. (2024). Deanthropomorphising NLP: Can a language model be conscious?</w:t>
+      </w:r>
+      <w:r>
+        <w:t xml:space="preserve"> </w:t>
+      </w:r>
+      <w:r>
+        <w:rPr>
+          <w:i/>
+          <w:iCs/>
+        </w:rPr>
+        <w:t xml:space="preserve">PLOS ONE</w:t>
+      </w:r>
+      <w:r>
+        <w:t xml:space="preserve">, 19(12), e0307521.</w:t>
       </w:r>
     </w:p>
     <w:p>
@@ -4526,15 +4805,6 @@
     <w:abstractNumId w:val="991"/>
   </w:num>
   <w:num w:numId="1004">
-    <w:abstractNumId w:val="991"/>
-  </w:num>
-  <w:num w:numId="1005">
-    <w:abstractNumId w:val="991"/>
-  </w:num>
-  <w:num w:numId="1006">
-    <w:abstractNumId w:val="991"/>
-  </w:num>
-  <w:num w:numId="1007">
     <w:abstractNumId w:val="99411"/>
     <w:lvlOverride w:ilvl="0">
       <w:startOverride w:val="1"/>
@@ -4564,6 +4834,15 @@
       <w:startOverride w:val="1"/>
     </w:lvlOverride>
   </w:num>
+  <w:num w:numId="1005">
+    <w:abstractNumId w:val="991"/>
+  </w:num>
+  <w:num w:numId="1006">
+    <w:abstractNumId w:val="991"/>
+  </w:num>
+  <w:num w:numId="1007">
+    <w:abstractNumId w:val="991"/>
+  </w:num>
   <w:num w:numId="1008">
     <w:abstractNumId w:val="991"/>
   </w:num>
@@ -4589,21 +4868,6 @@
     <w:abstractNumId w:val="991"/>
   </w:num>
   <w:num w:numId="1016">
-    <w:abstractNumId w:val="991"/>
-  </w:num>
-  <w:num w:numId="1017">
-    <w:abstractNumId w:val="991"/>
-  </w:num>
-  <w:num w:numId="1018">
-    <w:abstractNumId w:val="991"/>
-  </w:num>
-  <w:num w:numId="1019">
-    <w:abstractNumId w:val="991"/>
-  </w:num>
-  <w:num w:numId="1020">
-    <w:abstractNumId w:val="991"/>
-  </w:num>
-  <w:num w:numId="1021">
     <w:abstractNumId w:val="991"/>
   </w:num>
 </w:numbering>

</xml_diff>